<commit_message>
Updated java version notes
</commit_message>
<xml_diff>
--- a/V-IMP-Notes-TechLearning/CoreJava/JavaVersions/AllFeaturesInOneline.docx
+++ b/V-IMP-Notes-TechLearning/CoreJava/JavaVersions/AllFeaturesInOneline.docx
@@ -9,6 +9,9 @@
     <w:p/>
     <w:p>
       <w:r>
+        <w:rPr>
+          <w:noProof/>
+        </w:rPr>
         <w:drawing>
           <wp:inline distT="0" distB="0" distL="0" distR="0" wp14:anchorId="745CEDE1" wp14:editId="45335938">
             <wp:extent cx="5731510" cy="5856605"/>
@@ -52,6 +55,9 @@
     <w:p/>
     <w:p>
       <w:r>
+        <w:rPr>
+          <w:noProof/>
+        </w:rPr>
         <w:lastRenderedPageBreak/>
         <w:drawing>
           <wp:inline distT="0" distB="0" distL="0" distR="0" wp14:anchorId="00FB503C" wp14:editId="063B7430">
@@ -89,6 +95,153 @@
           </wp:inline>
         </w:drawing>
       </w:r>
+      <w:r>
+        <w:rPr>
+          <w:b/>
+          <w:bCs/>
+        </w:rPr>
+        <w:t>Java 15 Features)</w:t>
+      </w:r>
+    </w:p>
+    <w:p>
+      <w:r>
+        <w:drawing>
+          <wp:inline distT="0" distB="0" distL="0" distR="0" wp14:anchorId="5961A49A" wp14:editId="7AD8482D">
+            <wp:extent cx="5731510" cy="5274310"/>
+            <wp:effectExtent l="0" t="0" r="2540" b="2540"/>
+            <wp:docPr id="1793534271" name="Picture 1"/>
+            <wp:cNvGraphicFramePr>
+              <a:graphicFrameLocks xmlns:a="http://schemas.openxmlformats.org/drawingml/2006/main" noChangeAspect="1"/>
+            </wp:cNvGraphicFramePr>
+            <a:graphic xmlns:a="http://schemas.openxmlformats.org/drawingml/2006/main">
+              <a:graphicData uri="http://schemas.openxmlformats.org/drawingml/2006/picture">
+                <pic:pic xmlns:pic="http://schemas.openxmlformats.org/drawingml/2006/picture">
+                  <pic:nvPicPr>
+                    <pic:cNvPr id="1793534271" name=""/>
+                    <pic:cNvPicPr/>
+                  </pic:nvPicPr>
+                  <pic:blipFill>
+                    <a:blip r:embed="rId7"/>
+                    <a:stretch>
+                      <a:fillRect/>
+                    </a:stretch>
+                  </pic:blipFill>
+                  <pic:spPr>
+                    <a:xfrm>
+                      <a:off x="0" y="0"/>
+                      <a:ext cx="5731510" cy="5274310"/>
+                    </a:xfrm>
+                    <a:prstGeom prst="rect">
+                      <a:avLst/>
+                    </a:prstGeom>
+                  </pic:spPr>
+                </pic:pic>
+              </a:graphicData>
+            </a:graphic>
+          </wp:inline>
+        </w:drawing>
+      </w:r>
+    </w:p>
+    <w:p/>
+    <w:p>
+      <w:r>
+        <w:t>Java 17 Features)</w:t>
+      </w:r>
+    </w:p>
+    <w:p>
+      <w:r>
+        <w:drawing>
+          <wp:inline distT="0" distB="0" distL="0" distR="0" wp14:anchorId="4C6A35EB" wp14:editId="21A3506A">
+            <wp:extent cx="4640982" cy="4953429"/>
+            <wp:effectExtent l="0" t="0" r="7620" b="0"/>
+            <wp:docPr id="1202630423" name="Picture 1"/>
+            <wp:cNvGraphicFramePr>
+              <a:graphicFrameLocks xmlns:a="http://schemas.openxmlformats.org/drawingml/2006/main" noChangeAspect="1"/>
+            </wp:cNvGraphicFramePr>
+            <a:graphic xmlns:a="http://schemas.openxmlformats.org/drawingml/2006/main">
+              <a:graphicData uri="http://schemas.openxmlformats.org/drawingml/2006/picture">
+                <pic:pic xmlns:pic="http://schemas.openxmlformats.org/drawingml/2006/picture">
+                  <pic:nvPicPr>
+                    <pic:cNvPr id="1202630423" name=""/>
+                    <pic:cNvPicPr/>
+                  </pic:nvPicPr>
+                  <pic:blipFill>
+                    <a:blip r:embed="rId8"/>
+                    <a:stretch>
+                      <a:fillRect/>
+                    </a:stretch>
+                  </pic:blipFill>
+                  <pic:spPr>
+                    <a:xfrm>
+                      <a:off x="0" y="0"/>
+                      <a:ext cx="4640982" cy="4953429"/>
+                    </a:xfrm>
+                    <a:prstGeom prst="rect">
+                      <a:avLst/>
+                    </a:prstGeom>
+                  </pic:spPr>
+                </pic:pic>
+              </a:graphicData>
+            </a:graphic>
+          </wp:inline>
+        </w:drawing>
+      </w:r>
+    </w:p>
+    <w:p/>
+    <w:p>
+      <w:pPr>
+        <w:rPr>
+          <w:b/>
+          <w:bCs/>
+        </w:rPr>
+      </w:pPr>
+      <w:r>
+        <w:rPr>
+          <w:b/>
+          <w:bCs/>
+        </w:rPr>
+        <w:t>Java 21 Features)</w:t>
+      </w:r>
+    </w:p>
+    <w:p>
+      <w:r>
+        <w:lastRenderedPageBreak/>
+        <w:drawing>
+          <wp:inline distT="0" distB="0" distL="0" distR="0" wp14:anchorId="6AFFAD09" wp14:editId="2CD9E6DD">
+            <wp:extent cx="5731510" cy="8771890"/>
+            <wp:effectExtent l="0" t="0" r="2540" b="0"/>
+            <wp:docPr id="654053491" name="Picture 1"/>
+            <wp:cNvGraphicFramePr>
+              <a:graphicFrameLocks xmlns:a="http://schemas.openxmlformats.org/drawingml/2006/main" noChangeAspect="1"/>
+            </wp:cNvGraphicFramePr>
+            <a:graphic xmlns:a="http://schemas.openxmlformats.org/drawingml/2006/main">
+              <a:graphicData uri="http://schemas.openxmlformats.org/drawingml/2006/picture">
+                <pic:pic xmlns:pic="http://schemas.openxmlformats.org/drawingml/2006/picture">
+                  <pic:nvPicPr>
+                    <pic:cNvPr id="654053491" name=""/>
+                    <pic:cNvPicPr/>
+                  </pic:nvPicPr>
+                  <pic:blipFill>
+                    <a:blip r:embed="rId9"/>
+                    <a:stretch>
+                      <a:fillRect/>
+                    </a:stretch>
+                  </pic:blipFill>
+                  <pic:spPr>
+                    <a:xfrm>
+                      <a:off x="0" y="0"/>
+                      <a:ext cx="5731510" cy="8771890"/>
+                    </a:xfrm>
+                    <a:prstGeom prst="rect">
+                      <a:avLst/>
+                    </a:prstGeom>
+                  </pic:spPr>
+                </pic:pic>
+              </a:graphicData>
+            </a:graphic>
+          </wp:inline>
+        </w:drawing>
+      </w:r>
     </w:p>
     <w:p/>
     <w:p/>
@@ -114,7 +267,7 @@
                     <pic:cNvPicPr/>
                   </pic:nvPicPr>
                   <pic:blipFill>
-                    <a:blip r:embed="rId7"/>
+                    <a:blip r:embed="rId10"/>
                     <a:stretch>
                       <a:fillRect/>
                     </a:stretch>
@@ -160,114 +313,109 @@
           <w:b/>
           <w:bCs/>
         </w:rPr>
+        <w:t>Java 14 standardized</w:t>
+      </w:r>
+    </w:p>
+    <w:p>
+      <w:pPr>
+        <w:numPr>
+          <w:ilvl w:val="0"/>
+          <w:numId w:val="9"/>
+        </w:numPr>
+      </w:pPr>
+      <w:r>
+        <w:t>Switch Expressions</w:t>
+      </w:r>
+    </w:p>
+    <w:p>
+      <w:r>
+        <w:rPr>
+          <w:b/>
+          <w:bCs/>
+        </w:rPr>
+        <w:t>Java 15 standardized</w:t>
+      </w:r>
+    </w:p>
+    <w:p>
+      <w:pPr>
+        <w:numPr>
+          <w:ilvl w:val="0"/>
+          <w:numId w:val="10"/>
+        </w:numPr>
+      </w:pPr>
+      <w:r>
+        <w:t>Text Blocks</w:t>
+      </w:r>
+    </w:p>
+    <w:p>
+      <w:r>
+        <w:rPr>
+          <w:b/>
+          <w:bCs/>
+        </w:rPr>
+        <w:t>Java 16 standardized</w:t>
+      </w:r>
+    </w:p>
+    <w:p>
+      <w:pPr>
+        <w:numPr>
+          <w:ilvl w:val="0"/>
+          <w:numId w:val="11"/>
+        </w:numPr>
+      </w:pPr>
+      <w:r>
+        <w:t>Records</w:t>
+      </w:r>
+    </w:p>
+    <w:p>
+      <w:pPr>
+        <w:numPr>
+          <w:ilvl w:val="0"/>
+          <w:numId w:val="11"/>
+        </w:numPr>
+      </w:pPr>
+      <w:r>
+        <w:t>Pattern Matching for instanceof</w:t>
+      </w:r>
+    </w:p>
+    <w:p>
+      <w:r>
+        <w:rPr>
+          <w:b/>
+          <w:bCs/>
+        </w:rPr>
+        <w:t>Java 17 standardized</w:t>
+      </w:r>
+    </w:p>
+    <w:p>
+      <w:pPr>
+        <w:numPr>
+          <w:ilvl w:val="0"/>
+          <w:numId w:val="12"/>
+        </w:numPr>
+      </w:pPr>
+      <w:r>
+        <w:t>Sealed Classes</w:t>
+      </w:r>
+    </w:p>
+    <w:p>
+      <w:r>
+        <w:rPr>
+          <w:b/>
+          <w:bCs/>
+        </w:rPr>
+        <w:t>Java 21 standardized</w:t>
+      </w:r>
+    </w:p>
+    <w:p>
+      <w:pPr>
+        <w:numPr>
+          <w:ilvl w:val="0"/>
+          <w:numId w:val="13"/>
+        </w:numPr>
+      </w:pPr>
+      <w:r>
         <w:lastRenderedPageBreak/>
-        <w:t>Java 14 standardized</w:t>
-      </w:r>
-    </w:p>
-    <w:p>
-      <w:pPr>
-        <w:numPr>
-          <w:ilvl w:val="0"/>
-          <w:numId w:val="9"/>
-        </w:numPr>
-      </w:pPr>
-      <w:r>
-        <w:t>Switch Expressions</w:t>
-      </w:r>
-    </w:p>
-    <w:p>
-      <w:r>
-        <w:rPr>
-          <w:b/>
-          <w:bCs/>
-        </w:rPr>
-        <w:t>Java 15 standardized</w:t>
-      </w:r>
-    </w:p>
-    <w:p>
-      <w:pPr>
-        <w:numPr>
-          <w:ilvl w:val="0"/>
-          <w:numId w:val="10"/>
-        </w:numPr>
-      </w:pPr>
-      <w:r>
-        <w:t>Text Blocks</w:t>
-      </w:r>
-    </w:p>
-    <w:p>
-      <w:r>
-        <w:rPr>
-          <w:b/>
-          <w:bCs/>
-        </w:rPr>
-        <w:t>Java 16 standardized</w:t>
-      </w:r>
-    </w:p>
-    <w:p>
-      <w:pPr>
-        <w:numPr>
-          <w:ilvl w:val="0"/>
-          <w:numId w:val="11"/>
-        </w:numPr>
-      </w:pPr>
-      <w:r>
-        <w:t>Records</w:t>
-      </w:r>
-    </w:p>
-    <w:p>
-      <w:pPr>
-        <w:numPr>
-          <w:ilvl w:val="0"/>
-          <w:numId w:val="11"/>
-        </w:numPr>
-      </w:pPr>
-      <w:r>
-        <w:t xml:space="preserve">Pattern Matching for </w:t>
-      </w:r>
-      <w:proofErr w:type="spellStart"/>
-      <w:r>
-        <w:t>instanceof</w:t>
-      </w:r>
-      <w:proofErr w:type="spellEnd"/>
-    </w:p>
-    <w:p>
-      <w:r>
-        <w:rPr>
-          <w:b/>
-          <w:bCs/>
-        </w:rPr>
-        <w:t>Java 17 standardized</w:t>
-      </w:r>
-    </w:p>
-    <w:p>
-      <w:pPr>
-        <w:numPr>
-          <w:ilvl w:val="0"/>
-          <w:numId w:val="12"/>
-        </w:numPr>
-      </w:pPr>
-      <w:r>
-        <w:t>Sealed Classes</w:t>
-      </w:r>
-    </w:p>
-    <w:p>
-      <w:r>
-        <w:rPr>
-          <w:b/>
-          <w:bCs/>
-        </w:rPr>
-        <w:t>Java 21 standardized</w:t>
-      </w:r>
-    </w:p>
-    <w:p>
-      <w:pPr>
-        <w:numPr>
-          <w:ilvl w:val="0"/>
-          <w:numId w:val="13"/>
-        </w:numPr>
-      </w:pPr>
-      <w:r>
         <w:t>Virtual Threads</w:t>
       </w:r>
     </w:p>
@@ -335,21 +483,8 @@
       </w:r>
     </w:p>
     <w:p>
-      <w:proofErr w:type="gramStart"/>
-      <w:r>
-        <w:t>Preview  →</w:t>
-      </w:r>
-      <w:proofErr w:type="gramEnd"/>
-      <w:r>
-        <w:t xml:space="preserve">  Second Preview (</w:t>
-      </w:r>
-      <w:proofErr w:type="gramStart"/>
-      <w:r>
-        <w:t>sometimes)  →</w:t>
-      </w:r>
-      <w:proofErr w:type="gramEnd"/>
-      <w:r>
-        <w:t xml:space="preserve">  Standard (final release)</w:t>
+      <w:r>
+        <w:t>Preview  →  Second Preview (sometimes)  →  Standard (final release)</w:t>
       </w:r>
     </w:p>
     <w:p>
@@ -503,7 +638,7 @@
                     <pic:cNvPicPr/>
                   </pic:nvPicPr>
                   <pic:blipFill>
-                    <a:blip r:embed="rId8"/>
+                    <a:blip r:embed="rId11"/>
                     <a:stretch>
                       <a:fillRect/>
                     </a:stretch>
@@ -530,10 +665,134 @@
     <w:p/>
     <w:p/>
     <w:p/>
-    <w:p/>
-    <w:p/>
-    <w:p/>
-    <w:p/>
+    <w:p>
+      <w:r>
+        <w:lastRenderedPageBreak/>
+        <w:drawing>
+          <wp:inline distT="0" distB="0" distL="0" distR="0" wp14:anchorId="4AB753C9" wp14:editId="11A7DD32">
+            <wp:extent cx="5731510" cy="5192395"/>
+            <wp:effectExtent l="0" t="0" r="2540" b="8255"/>
+            <wp:docPr id="649251703" name="Picture 1"/>
+            <wp:cNvGraphicFramePr>
+              <a:graphicFrameLocks xmlns:a="http://schemas.openxmlformats.org/drawingml/2006/main" noChangeAspect="1"/>
+            </wp:cNvGraphicFramePr>
+            <a:graphic xmlns:a="http://schemas.openxmlformats.org/drawingml/2006/main">
+              <a:graphicData uri="http://schemas.openxmlformats.org/drawingml/2006/picture">
+                <pic:pic xmlns:pic="http://schemas.openxmlformats.org/drawingml/2006/picture">
+                  <pic:nvPicPr>
+                    <pic:cNvPr id="649251703" name=""/>
+                    <pic:cNvPicPr/>
+                  </pic:nvPicPr>
+                  <pic:blipFill>
+                    <a:blip r:embed="rId12"/>
+                    <a:stretch>
+                      <a:fillRect/>
+                    </a:stretch>
+                  </pic:blipFill>
+                  <pic:spPr>
+                    <a:xfrm>
+                      <a:off x="0" y="0"/>
+                      <a:ext cx="5731510" cy="5192395"/>
+                    </a:xfrm>
+                    <a:prstGeom prst="rect">
+                      <a:avLst/>
+                    </a:prstGeom>
+                  </pic:spPr>
+                </pic:pic>
+              </a:graphicData>
+            </a:graphic>
+          </wp:inline>
+        </w:drawing>
+      </w:r>
+    </w:p>
+    <w:p/>
+    <w:p/>
+    <w:p/>
+    <w:p/>
+    <w:p/>
+    <w:p/>
+    <w:p/>
+    <w:p/>
+    <w:p>
+      <w:r>
+        <w:lastRenderedPageBreak/>
+        <w:drawing>
+          <wp:inline distT="0" distB="0" distL="0" distR="0" wp14:anchorId="5BFDC024" wp14:editId="740F81B1">
+            <wp:extent cx="5731510" cy="3743325"/>
+            <wp:effectExtent l="0" t="0" r="2540" b="9525"/>
+            <wp:docPr id="166152969" name="Picture 1"/>
+            <wp:cNvGraphicFramePr>
+              <a:graphicFrameLocks xmlns:a="http://schemas.openxmlformats.org/drawingml/2006/main" noChangeAspect="1"/>
+            </wp:cNvGraphicFramePr>
+            <a:graphic xmlns:a="http://schemas.openxmlformats.org/drawingml/2006/main">
+              <a:graphicData uri="http://schemas.openxmlformats.org/drawingml/2006/picture">
+                <pic:pic xmlns:pic="http://schemas.openxmlformats.org/drawingml/2006/picture">
+                  <pic:nvPicPr>
+                    <pic:cNvPr id="166152969" name=""/>
+                    <pic:cNvPicPr/>
+                  </pic:nvPicPr>
+                  <pic:blipFill>
+                    <a:blip r:embed="rId13"/>
+                    <a:stretch>
+                      <a:fillRect/>
+                    </a:stretch>
+                  </pic:blipFill>
+                  <pic:spPr>
+                    <a:xfrm>
+                      <a:off x="0" y="0"/>
+                      <a:ext cx="5731510" cy="3743325"/>
+                    </a:xfrm>
+                    <a:prstGeom prst="rect">
+                      <a:avLst/>
+                    </a:prstGeom>
+                  </pic:spPr>
+                </pic:pic>
+              </a:graphicData>
+            </a:graphic>
+          </wp:inline>
+        </w:drawing>
+      </w:r>
+    </w:p>
+    <w:p/>
+    <w:p>
+      <w:r>
+        <w:drawing>
+          <wp:inline distT="0" distB="0" distL="0" distR="0" wp14:anchorId="416C9E5A" wp14:editId="2A598A5B">
+            <wp:extent cx="5731510" cy="4570730"/>
+            <wp:effectExtent l="0" t="0" r="2540" b="1270"/>
+            <wp:docPr id="1649086753" name="Picture 1"/>
+            <wp:cNvGraphicFramePr>
+              <a:graphicFrameLocks xmlns:a="http://schemas.openxmlformats.org/drawingml/2006/main" noChangeAspect="1"/>
+            </wp:cNvGraphicFramePr>
+            <a:graphic xmlns:a="http://schemas.openxmlformats.org/drawingml/2006/main">
+              <a:graphicData uri="http://schemas.openxmlformats.org/drawingml/2006/picture">
+                <pic:pic xmlns:pic="http://schemas.openxmlformats.org/drawingml/2006/picture">
+                  <pic:nvPicPr>
+                    <pic:cNvPr id="1649086753" name=""/>
+                    <pic:cNvPicPr/>
+                  </pic:nvPicPr>
+                  <pic:blipFill>
+                    <a:blip r:embed="rId14"/>
+                    <a:stretch>
+                      <a:fillRect/>
+                    </a:stretch>
+                  </pic:blipFill>
+                  <pic:spPr>
+                    <a:xfrm>
+                      <a:off x="0" y="0"/>
+                      <a:ext cx="5731510" cy="4570730"/>
+                    </a:xfrm>
+                    <a:prstGeom prst="rect">
+                      <a:avLst/>
+                    </a:prstGeom>
+                  </pic:spPr>
+                </pic:pic>
+              </a:graphicData>
+            </a:graphic>
+          </wp:inline>
+        </w:drawing>
+      </w:r>
+    </w:p>
     <w:p/>
     <w:p/>
     <w:p>
@@ -599,1480 +858,1328 @@
         <w:t>HTTP Client API (Standard)</w:t>
       </w:r>
       <w:r>
-        <w:t xml:space="preserve"> – Introduces a modern HTTP client supporting HTTP/1.1, HTTP/2, and </w:t>
-      </w:r>
-      <w:proofErr w:type="spellStart"/>
-      <w:r>
-        <w:t>WebSockets</w:t>
-      </w:r>
-      <w:proofErr w:type="spellEnd"/>
+        <w:t xml:space="preserve"> – Introduces a modern HTTP client supporting HTTP/1.1, HTTP/2, and WebSockets.</w:t>
+      </w:r>
+    </w:p>
+    <w:p>
+      <w:pPr>
+        <w:numPr>
+          <w:ilvl w:val="0"/>
+          <w:numId w:val="1"/>
+        </w:numPr>
+      </w:pPr>
+      <w:r>
+        <w:rPr>
+          <w:b/>
+          <w:bCs/>
+        </w:rPr>
+        <w:t>Local-Variable Syntax for Lambda Parameters</w:t>
+      </w:r>
+      <w:r>
+        <w:t xml:space="preserve"> – Allows the use of var in lambda parameters for improved readability and annotations.</w:t>
+      </w:r>
+    </w:p>
+    <w:p>
+      <w:pPr>
+        <w:numPr>
+          <w:ilvl w:val="0"/>
+          <w:numId w:val="1"/>
+        </w:numPr>
+      </w:pPr>
+      <w:r>
+        <w:rPr>
+          <w:b/>
+          <w:bCs/>
+        </w:rPr>
+        <w:t>Launch Single-File Source-Code Programs</w:t>
+      </w:r>
+      <w:r>
+        <w:t xml:space="preserve"> – Enables running a Java program directly from a .java file without compiling it first.</w:t>
+      </w:r>
+    </w:p>
+    <w:p>
+      <w:pPr>
+        <w:numPr>
+          <w:ilvl w:val="0"/>
+          <w:numId w:val="1"/>
+        </w:numPr>
+      </w:pPr>
+      <w:r>
+        <w:rPr>
+          <w:b/>
+          <w:bCs/>
+        </w:rPr>
+        <w:t>Z Garbage Collector (Experimental)</w:t>
+      </w:r>
+      <w:r>
+        <w:t xml:space="preserve"> – Introduces a scalable low-latency garbage collector designed for large heaps.</w:t>
+      </w:r>
+    </w:p>
+    <w:p>
+      <w:pPr>
+        <w:numPr>
+          <w:ilvl w:val="0"/>
+          <w:numId w:val="1"/>
+        </w:numPr>
+      </w:pPr>
+      <w:r>
+        <w:rPr>
+          <w:b/>
+          <w:bCs/>
+        </w:rPr>
+        <w:t>Epsilon Garbage Collector</w:t>
+      </w:r>
+      <w:r>
+        <w:t xml:space="preserve"> – Adds a no-operation garbage collector used for performance testing and memory benchmarking.</w:t>
+      </w:r>
+    </w:p>
+    <w:p>
+      <w:pPr>
+        <w:numPr>
+          <w:ilvl w:val="0"/>
+          <w:numId w:val="1"/>
+        </w:numPr>
+      </w:pPr>
+      <w:r>
+        <w:rPr>
+          <w:b/>
+          <w:bCs/>
+        </w:rPr>
+        <w:t>Dynamic Class-File Constants</w:t>
+      </w:r>
+      <w:r>
+        <w:t xml:space="preserve"> – Extends the class-file format to support dynamically computed constants.</w:t>
+      </w:r>
+    </w:p>
+    <w:p>
+      <w:pPr>
+        <w:numPr>
+          <w:ilvl w:val="0"/>
+          <w:numId w:val="1"/>
+        </w:numPr>
+      </w:pPr>
+      <w:r>
+        <w:rPr>
+          <w:b/>
+          <w:bCs/>
+        </w:rPr>
+        <w:t>New String Methods</w:t>
+      </w:r>
+      <w:r>
+        <w:t xml:space="preserve"> – Adds useful methods like isBlank(), lines(), strip(), and repeat() to the String class.</w:t>
+      </w:r>
+    </w:p>
+    <w:p>
+      <w:pPr>
+        <w:numPr>
+          <w:ilvl w:val="0"/>
+          <w:numId w:val="1"/>
+        </w:numPr>
+      </w:pPr>
+      <w:r>
+        <w:rPr>
+          <w:b/>
+          <w:bCs/>
+        </w:rPr>
+        <w:t>New File Methods</w:t>
+      </w:r>
+      <w:r>
+        <w:t xml:space="preserve"> – Introduces methods such as readString() and writeString() in the Files API.</w:t>
+      </w:r>
+    </w:p>
+    <w:p>
+      <w:pPr>
+        <w:numPr>
+          <w:ilvl w:val="0"/>
+          <w:numId w:val="1"/>
+        </w:numPr>
+      </w:pPr>
+      <w:r>
+        <w:rPr>
+          <w:b/>
+          <w:bCs/>
+        </w:rPr>
+        <w:t>Nest-Based Access Control</w:t>
+      </w:r>
+      <w:r>
+        <w:t xml:space="preserve"> – Allows nested classes to access each other's private members more efficiently.</w:t>
+      </w:r>
+    </w:p>
+    <w:p>
+      <w:pPr>
+        <w:numPr>
+          <w:ilvl w:val="0"/>
+          <w:numId w:val="1"/>
+        </w:numPr>
+      </w:pPr>
+      <w:r>
+        <w:rPr>
+          <w:b/>
+          <w:bCs/>
+        </w:rPr>
+        <w:t>Remove Java EE and CORBA Modules</w:t>
+      </w:r>
+      <w:r>
+        <w:t xml:space="preserve"> – Removes deprecated Java EE and CORBA modules from the JDK.</w:t>
+      </w:r>
+    </w:p>
+    <w:p/>
+    <w:p/>
+    <w:p/>
+    <w:p/>
+    <w:p/>
+    <w:p>
+      <w:r>
+        <w:rPr>
+          <w:b/>
+          <w:bCs/>
+        </w:rPr>
+        <w:t>Java 12</w:t>
+      </w:r>
+      <w:r>
+        <w:t xml:space="preserve">, each in </w:t>
+      </w:r>
+      <w:r>
+        <w:rPr>
+          <w:b/>
+          <w:bCs/>
+        </w:rPr>
+        <w:t>one single statement</w:t>
+      </w:r>
+      <w:r>
+        <w:t>:</w:t>
+      </w:r>
+    </w:p>
+    <w:p>
+      <w:pPr>
+        <w:numPr>
+          <w:ilvl w:val="0"/>
+          <w:numId w:val="2"/>
+        </w:numPr>
+      </w:pPr>
+      <w:r>
+        <w:rPr>
+          <w:b/>
+          <w:bCs/>
+        </w:rPr>
+        <w:lastRenderedPageBreak/>
+        <w:t>Switch Expressions (Preview)</w:t>
+      </w:r>
+      <w:r>
+        <w:t xml:space="preserve"> – Enhances the switch statement to return values and use the arrow (-&gt;) syntax.</w:t>
+      </w:r>
+    </w:p>
+    <w:p>
+      <w:pPr>
+        <w:numPr>
+          <w:ilvl w:val="0"/>
+          <w:numId w:val="2"/>
+        </w:numPr>
+      </w:pPr>
+      <w:r>
+        <w:rPr>
+          <w:b/>
+          <w:bCs/>
+        </w:rPr>
+        <w:t>Shenandoah Garbage Collector (Experimental)</w:t>
+      </w:r>
+      <w:r>
+        <w:t xml:space="preserve"> – Introduces a low-pause-time garbage collector designed to reduce GC pause times.</w:t>
+      </w:r>
+    </w:p>
+    <w:p>
+      <w:pPr>
+        <w:numPr>
+          <w:ilvl w:val="0"/>
+          <w:numId w:val="2"/>
+        </w:numPr>
+      </w:pPr>
+      <w:r>
+        <w:rPr>
+          <w:b/>
+          <w:bCs/>
+        </w:rPr>
+        <w:t>JVM Constants API</w:t>
+      </w:r>
+      <w:r>
+        <w:t xml:space="preserve"> – Provides an API to model nominal descriptions of key class-file and runtime artifacts.</w:t>
+      </w:r>
+    </w:p>
+    <w:p>
+      <w:pPr>
+        <w:numPr>
+          <w:ilvl w:val="0"/>
+          <w:numId w:val="2"/>
+        </w:numPr>
+      </w:pPr>
+      <w:r>
+        <w:rPr>
+          <w:b/>
+          <w:bCs/>
+        </w:rPr>
+        <w:t>One AArch64 Port (ARM64)</w:t>
+      </w:r>
+      <w:r>
+        <w:t xml:space="preserve"> – Unifies the two existing ARM64 ports into a single supported implementation.</w:t>
+      </w:r>
+    </w:p>
+    <w:p>
+      <w:pPr>
+        <w:numPr>
+          <w:ilvl w:val="0"/>
+          <w:numId w:val="2"/>
+        </w:numPr>
+      </w:pPr>
+      <w:r>
+        <w:rPr>
+          <w:b/>
+          <w:bCs/>
+        </w:rPr>
+        <w:t>Default CDS Archives</w:t>
+      </w:r>
+      <w:r>
+        <w:t xml:space="preserve"> – Improves application startup time by including default class data sharing archives.</w:t>
+      </w:r>
+    </w:p>
+    <w:p>
+      <w:pPr>
+        <w:numPr>
+          <w:ilvl w:val="0"/>
+          <w:numId w:val="2"/>
+        </w:numPr>
+      </w:pPr>
+      <w:r>
+        <w:rPr>
+          <w:b/>
+          <w:bCs/>
+        </w:rPr>
+        <w:t>Abortable Mixed Collections for G1</w:t>
+      </w:r>
+      <w:r>
+        <w:t xml:space="preserve"> – Improves the G1 Garbage Collector by allowing mixed collections to be aborted if they exceed pause time targets.</w:t>
+      </w:r>
+    </w:p>
+    <w:p>
+      <w:pPr>
+        <w:numPr>
+          <w:ilvl w:val="0"/>
+          <w:numId w:val="2"/>
+        </w:numPr>
+      </w:pPr>
+      <w:r>
+        <w:rPr>
+          <w:b/>
+          <w:bCs/>
+        </w:rPr>
+        <w:t>Promptly Return Unused Committed Memory from G1</w:t>
+      </w:r>
+      <w:r>
+        <w:t xml:space="preserve"> – Enables G1 to release unused memory back to the operating system more quickly.</w:t>
+      </w:r>
+    </w:p>
+    <w:p/>
+    <w:p/>
+    <w:p/>
+    <w:p/>
+    <w:p>
+      <w:r>
+        <w:rPr>
+          <w:b/>
+          <w:bCs/>
+        </w:rPr>
+        <w:t>Java 13</w:t>
+      </w:r>
+      <w:r>
+        <w:t xml:space="preserve">, each in </w:t>
+      </w:r>
+      <w:r>
+        <w:rPr>
+          <w:b/>
+          <w:bCs/>
+        </w:rPr>
+        <w:t>one single statement</w:t>
+      </w:r>
+      <w:r>
+        <w:t>:</w:t>
+      </w:r>
+    </w:p>
+    <w:p>
+      <w:pPr>
+        <w:numPr>
+          <w:ilvl w:val="0"/>
+          <w:numId w:val="3"/>
+        </w:numPr>
+      </w:pPr>
+      <w:r>
+        <w:rPr>
+          <w:b/>
+          <w:bCs/>
+        </w:rPr>
+        <w:t>Text Blocks (Preview)</w:t>
+      </w:r>
+      <w:r>
+        <w:t xml:space="preserve"> – Introduces multi-line string literals using triple quotes (""") for improved readability.</w:t>
+      </w:r>
+    </w:p>
+    <w:p>
+      <w:pPr>
+        <w:numPr>
+          <w:ilvl w:val="0"/>
+          <w:numId w:val="3"/>
+        </w:numPr>
+      </w:pPr>
+      <w:r>
+        <w:rPr>
+          <w:b/>
+          <w:bCs/>
+        </w:rPr>
+        <w:t>Switch Expressions (Second Preview)</w:t>
+      </w:r>
+      <w:r>
+        <w:t xml:space="preserve"> – Enhances the switch statement to return values and use the arrow (-&gt;) syntax.</w:t>
+      </w:r>
+    </w:p>
+    <w:p>
+      <w:pPr>
+        <w:numPr>
+          <w:ilvl w:val="0"/>
+          <w:numId w:val="3"/>
+        </w:numPr>
+      </w:pPr>
+      <w:r>
+        <w:rPr>
+          <w:b/>
+          <w:bCs/>
+        </w:rPr>
+        <w:t>Dynamic CDS Archives</w:t>
+      </w:r>
+      <w:r>
+        <w:t xml:space="preserve"> – Improves application startup time by automatically generating class data sharing archives.</w:t>
+      </w:r>
+    </w:p>
+    <w:p>
+      <w:pPr>
+        <w:numPr>
+          <w:ilvl w:val="0"/>
+          <w:numId w:val="3"/>
+        </w:numPr>
+      </w:pPr>
+      <w:r>
+        <w:rPr>
+          <w:b/>
+          <w:bCs/>
+        </w:rPr>
+        <w:t>ZGC: Uncommit Unused Memory</w:t>
+      </w:r>
+      <w:r>
+        <w:t xml:space="preserve"> – Allows the Z Garbage Collector to return unused heap memory to the operating system.</w:t>
+      </w:r>
+    </w:p>
+    <w:p>
+      <w:pPr>
+        <w:numPr>
+          <w:ilvl w:val="0"/>
+          <w:numId w:val="3"/>
+        </w:numPr>
+      </w:pPr>
+      <w:r>
+        <w:rPr>
+          <w:b/>
+          <w:bCs/>
+        </w:rPr>
+        <w:t>Reimplement the Legacy Socket API</w:t>
+      </w:r>
+      <w:r>
+        <w:t xml:space="preserve"> – Rewrites the old socket implementation with a simpler and more maintainable design.</w:t>
+      </w:r>
+    </w:p>
+    <w:p/>
+    <w:p/>
+    <w:p>
+      <w:r>
+        <w:rPr>
+          <w:b/>
+          <w:bCs/>
+        </w:rPr>
+        <w:t>Java 14</w:t>
+      </w:r>
+      <w:r>
+        <w:t xml:space="preserve">, each in </w:t>
+      </w:r>
+      <w:r>
+        <w:rPr>
+          <w:b/>
+          <w:bCs/>
+        </w:rPr>
+        <w:t>one single statement</w:t>
+      </w:r>
+      <w:r>
+        <w:t>:</w:t>
+      </w:r>
+    </w:p>
+    <w:p>
+      <w:pPr>
+        <w:numPr>
+          <w:ilvl w:val="0"/>
+          <w:numId w:val="4"/>
+        </w:numPr>
+      </w:pPr>
+      <w:r>
+        <w:rPr>
+          <w:b/>
+          <w:bCs/>
+        </w:rPr>
+        <w:lastRenderedPageBreak/>
+        <w:t>Switch Expressions (Standard)</w:t>
+      </w:r>
+      <w:r>
+        <w:t xml:space="preserve"> – Allows switch to return values using a concise arrow (-&gt;) syntax.</w:t>
+      </w:r>
+    </w:p>
+    <w:p>
+      <w:pPr>
+        <w:numPr>
+          <w:ilvl w:val="0"/>
+          <w:numId w:val="4"/>
+        </w:numPr>
+      </w:pPr>
+      <w:r>
+        <w:rPr>
+          <w:b/>
+          <w:bCs/>
+        </w:rPr>
+        <w:t>Records (Preview)</w:t>
+      </w:r>
+      <w:r>
+        <w:t xml:space="preserve"> – Introduces a compact syntax for declaring immutable data carrier classes.</w:t>
+      </w:r>
+    </w:p>
+    <w:p>
+      <w:pPr>
+        <w:numPr>
+          <w:ilvl w:val="0"/>
+          <w:numId w:val="4"/>
+        </w:numPr>
+      </w:pPr>
+      <w:r>
+        <w:rPr>
+          <w:b/>
+          <w:bCs/>
+        </w:rPr>
+        <w:t>Pattern Matching for instanceof (Preview)</w:t>
+      </w:r>
+      <w:r>
+        <w:t xml:space="preserve"> – Simplifies type checking and casting into a single expression.</w:t>
+      </w:r>
+    </w:p>
+    <w:p>
+      <w:pPr>
+        <w:numPr>
+          <w:ilvl w:val="0"/>
+          <w:numId w:val="4"/>
+        </w:numPr>
+      </w:pPr>
+      <w:r>
+        <w:rPr>
+          <w:b/>
+          <w:bCs/>
+        </w:rPr>
+        <w:t>Helpful NullPointerExceptions</w:t>
+      </w:r>
+      <w:r>
+        <w:t xml:space="preserve"> – Provides detailed messages explaining exactly which variable was null.</w:t>
+      </w:r>
+    </w:p>
+    <w:p>
+      <w:pPr>
+        <w:numPr>
+          <w:ilvl w:val="0"/>
+          <w:numId w:val="4"/>
+        </w:numPr>
+      </w:pPr>
+      <w:r>
+        <w:rPr>
+          <w:b/>
+          <w:bCs/>
+        </w:rPr>
+        <w:t>Text Blocks (Second Preview)</w:t>
+      </w:r>
+      <w:r>
+        <w:t xml:space="preserve"> – Enables writing multi-line string literals using triple quotes.</w:t>
+      </w:r>
+    </w:p>
+    <w:p>
+      <w:pPr>
+        <w:numPr>
+          <w:ilvl w:val="0"/>
+          <w:numId w:val="4"/>
+        </w:numPr>
+      </w:pPr>
+      <w:r>
+        <w:rPr>
+          <w:b/>
+          <w:bCs/>
+        </w:rPr>
+        <w:t>Foreign-Memory Access API (Incubator)</w:t>
+      </w:r>
+      <w:r>
+        <w:t xml:space="preserve"> – Allows safe and efficient access to memory outside the Java heap.</w:t>
+      </w:r>
+    </w:p>
+    <w:p>
+      <w:pPr>
+        <w:numPr>
+          <w:ilvl w:val="0"/>
+          <w:numId w:val="4"/>
+        </w:numPr>
+      </w:pPr>
+      <w:r>
+        <w:rPr>
+          <w:b/>
+          <w:bCs/>
+        </w:rPr>
+        <w:t>Packaging Tool (Incubator)</w:t>
+      </w:r>
+      <w:r>
+        <w:t xml:space="preserve"> – Introduces jpackage to create native installers for Java applications.</w:t>
+      </w:r>
+    </w:p>
+    <w:p>
+      <w:pPr>
+        <w:numPr>
+          <w:ilvl w:val="0"/>
+          <w:numId w:val="4"/>
+        </w:numPr>
+      </w:pPr>
+      <w:r>
+        <w:rPr>
+          <w:b/>
+          <w:bCs/>
+        </w:rPr>
+        <w:t>NUMA-Aware Memory Allocation for G1</w:t>
+      </w:r>
+      <w:r>
+        <w:t xml:space="preserve"> – Improves performance by optimizing memory allocation on NUMA architectures.</w:t>
+      </w:r>
+    </w:p>
+    <w:p>
+      <w:pPr>
+        <w:numPr>
+          <w:ilvl w:val="0"/>
+          <w:numId w:val="4"/>
+        </w:numPr>
+      </w:pPr>
+      <w:r>
+        <w:rPr>
+          <w:b/>
+          <w:bCs/>
+        </w:rPr>
+        <w:t>ZGC on macOS and Windows</w:t>
+      </w:r>
+      <w:r>
+        <w:t xml:space="preserve"> – Extends support for the Z Garbage Collector to macOS and Windows.</w:t>
+      </w:r>
+    </w:p>
+    <w:p>
+      <w:pPr>
+        <w:numPr>
+          <w:ilvl w:val="0"/>
+          <w:numId w:val="4"/>
+        </w:numPr>
+      </w:pPr>
+      <w:r>
+        <w:rPr>
+          <w:b/>
+          <w:bCs/>
+        </w:rPr>
+        <w:t>Remove the CMS Garbage Collector</w:t>
+      </w:r>
+      <w:r>
+        <w:t xml:space="preserve"> – Removes the deprecated Concurrent Mark Sweep (CMS) garbage collector.</w:t>
+      </w:r>
+    </w:p>
+    <w:p/>
+    <w:p/>
+    <w:p>
+      <w:r>
+        <w:rPr>
+          <w:b/>
+          <w:bCs/>
+        </w:rPr>
+        <w:t>Java 15</w:t>
+      </w:r>
+      <w:r>
+        <w:t xml:space="preserve">, each in </w:t>
+      </w:r>
+      <w:r>
+        <w:rPr>
+          <w:b/>
+          <w:bCs/>
+        </w:rPr>
+        <w:t>one single statement</w:t>
+      </w:r>
+      <w:r>
+        <w:t>:</w:t>
+      </w:r>
+    </w:p>
+    <w:p>
+      <w:pPr>
+        <w:numPr>
+          <w:ilvl w:val="0"/>
+          <w:numId w:val="5"/>
+        </w:numPr>
+      </w:pPr>
+      <w:r>
+        <w:rPr>
+          <w:b/>
+          <w:bCs/>
+        </w:rPr>
+        <w:t>Text Blocks (Standard)</w:t>
+      </w:r>
+      <w:r>
+        <w:t xml:space="preserve"> – Provides a multi-line string syntax using triple quotes to write readable string literals.</w:t>
+      </w:r>
+    </w:p>
+    <w:p>
+      <w:pPr>
+        <w:numPr>
+          <w:ilvl w:val="0"/>
+          <w:numId w:val="5"/>
+        </w:numPr>
+      </w:pPr>
+      <w:r>
+        <w:rPr>
+          <w:b/>
+          <w:bCs/>
+        </w:rPr>
+        <w:t>Sealed Classes (Preview)</w:t>
+      </w:r>
+      <w:r>
+        <w:t xml:space="preserve"> – Restricts which classes can extend or implement a class or interface.</w:t>
+      </w:r>
+    </w:p>
+    <w:p>
+      <w:pPr>
+        <w:numPr>
+          <w:ilvl w:val="0"/>
+          <w:numId w:val="5"/>
+        </w:numPr>
+      </w:pPr>
+      <w:r>
+        <w:rPr>
+          <w:b/>
+          <w:bCs/>
+        </w:rPr>
+        <w:t>Hidden Classes</w:t>
+      </w:r>
+      <w:r>
+        <w:t xml:space="preserve"> – Introduces classes that are not discoverable and are mainly used by frameworks that generate classes dynamically.</w:t>
+      </w:r>
+    </w:p>
+    <w:p>
+      <w:pPr>
+        <w:numPr>
+          <w:ilvl w:val="0"/>
+          <w:numId w:val="5"/>
+        </w:numPr>
+      </w:pPr>
+      <w:r>
+        <w:rPr>
+          <w:b/>
+          <w:bCs/>
+        </w:rPr>
+        <w:t>Pattern Matching for instanceof (Second Preview)</w:t>
+      </w:r>
+      <w:r>
+        <w:t xml:space="preserve"> – Simplifies type checking and casting into a single concise expression.</w:t>
+      </w:r>
+    </w:p>
+    <w:p>
+      <w:pPr>
+        <w:numPr>
+          <w:ilvl w:val="0"/>
+          <w:numId w:val="5"/>
+        </w:numPr>
+      </w:pPr>
+      <w:r>
+        <w:rPr>
+          <w:b/>
+          <w:bCs/>
+        </w:rPr>
+        <w:t>Records (Second Preview)</w:t>
+      </w:r>
+      <w:r>
+        <w:t xml:space="preserve"> – Provides a concise syntax for defining immutable data carrier classes.</w:t>
+      </w:r>
+    </w:p>
+    <w:p>
+      <w:pPr>
+        <w:numPr>
+          <w:ilvl w:val="0"/>
+          <w:numId w:val="5"/>
+        </w:numPr>
+      </w:pPr>
+      <w:r>
+        <w:rPr>
+          <w:b/>
+          <w:bCs/>
+        </w:rPr>
+        <w:lastRenderedPageBreak/>
+        <w:t>Foreign-Memory Access API (Second Incubator)</w:t>
+      </w:r>
+      <w:r>
+        <w:t xml:space="preserve"> – Allows Java programs to safely access memory outside the Java heap.</w:t>
+      </w:r>
+    </w:p>
+    <w:p/>
+    <w:p>
+      <w:pPr>
+        <w:numPr>
+          <w:ilvl w:val="0"/>
+          <w:numId w:val="5"/>
+        </w:numPr>
+      </w:pPr>
+      <w:r>
+        <w:rPr>
+          <w:b/>
+          <w:bCs/>
+        </w:rPr>
+        <w:t>Edwards-Curve Digital Signature Algorithm (EdDSA)</w:t>
+      </w:r>
+      <w:r>
+        <w:t xml:space="preserve"> – Adds support for modern cryptographic digital signature algorithms.</w:t>
+      </w:r>
+    </w:p>
+    <w:p>
+      <w:pPr>
+        <w:numPr>
+          <w:ilvl w:val="0"/>
+          <w:numId w:val="5"/>
+        </w:numPr>
+      </w:pPr>
+      <w:r>
+        <w:rPr>
+          <w:b/>
+          <w:bCs/>
+        </w:rPr>
+        <w:t>ZGC Improvements</w:t>
+      </w:r>
+      <w:r>
+        <w:t xml:space="preserve"> – Enhances the Z Garbage Collector to support production use with better performance.</w:t>
+      </w:r>
+    </w:p>
+    <w:p>
+      <w:pPr>
+        <w:numPr>
+          <w:ilvl w:val="0"/>
+          <w:numId w:val="5"/>
+        </w:numPr>
+      </w:pPr>
+      <w:r>
+        <w:rPr>
+          <w:b/>
+          <w:bCs/>
+        </w:rPr>
+        <w:t>Shenandoah Garbage Collector (Production)</w:t>
+      </w:r>
+      <w:r>
+        <w:t xml:space="preserve"> – Introduces a low-pause-time garbage collector for improved application responsiveness.</w:t>
+      </w:r>
+    </w:p>
+    <w:p>
+      <w:pPr>
+        <w:numPr>
+          <w:ilvl w:val="0"/>
+          <w:numId w:val="5"/>
+        </w:numPr>
+      </w:pPr>
+      <w:r>
+        <w:rPr>
+          <w:b/>
+          <w:bCs/>
+        </w:rPr>
+        <w:t>Remove Nashorn JavaScript Engine</w:t>
+      </w:r>
+      <w:r>
+        <w:t xml:space="preserve"> – Removes the deprecated Nashorn JavaScript engine from the JDK.</w:t>
+      </w:r>
+    </w:p>
+    <w:p/>
+    <w:p/>
+    <w:p>
+      <w:r>
+        <w:rPr>
+          <w:b/>
+          <w:bCs/>
+        </w:rPr>
+        <w:t>Java 16</w:t>
+      </w:r>
+      <w:r>
+        <w:t xml:space="preserve">, each in </w:t>
+      </w:r>
+      <w:r>
+        <w:rPr>
+          <w:b/>
+          <w:bCs/>
+        </w:rPr>
+        <w:t>one single statement</w:t>
+      </w:r>
+      <w:r>
+        <w:t>:</w:t>
+      </w:r>
+    </w:p>
+    <w:p>
+      <w:pPr>
+        <w:numPr>
+          <w:ilvl w:val="0"/>
+          <w:numId w:val="6"/>
+        </w:numPr>
+      </w:pPr>
+      <w:r>
+        <w:rPr>
+          <w:b/>
+          <w:bCs/>
+        </w:rPr>
+        <w:t>Records</w:t>
+      </w:r>
+      <w:r>
+        <w:t xml:space="preserve"> – Introduces a compact syntax for declaring immutable data carrier classes.</w:t>
+      </w:r>
+    </w:p>
+    <w:p>
+      <w:pPr>
+        <w:numPr>
+          <w:ilvl w:val="0"/>
+          <w:numId w:val="6"/>
+        </w:numPr>
+      </w:pPr>
+      <w:r>
+        <w:rPr>
+          <w:b/>
+          <w:bCs/>
+        </w:rPr>
+        <w:t>Pattern Matching for instanceof</w:t>
+      </w:r>
+      <w:r>
+        <w:t xml:space="preserve"> – Simplifies type checking and casting in a single operation.</w:t>
+      </w:r>
+    </w:p>
+    <w:p>
+      <w:pPr>
+        <w:numPr>
+          <w:ilvl w:val="0"/>
+          <w:numId w:val="6"/>
+        </w:numPr>
+      </w:pPr>
+      <w:r>
+        <w:rPr>
+          <w:b/>
+          <w:bCs/>
+        </w:rPr>
+        <w:t>Sealed Classes (Preview)</w:t>
+      </w:r>
+      <w:r>
+        <w:t xml:space="preserve"> – Allows restricting which classes can extend or implement a class or interface.</w:t>
+      </w:r>
+    </w:p>
+    <w:p>
+      <w:pPr>
+        <w:numPr>
+          <w:ilvl w:val="0"/>
+          <w:numId w:val="6"/>
+        </w:numPr>
+      </w:pPr>
+      <w:r>
+        <w:rPr>
+          <w:b/>
+          <w:bCs/>
+        </w:rPr>
+        <w:t>Vector API (Incubator)</w:t>
+      </w:r>
+      <w:r>
+        <w:t xml:space="preserve"> – Provides an API for performing vector computations that utilize modern CPU SIMD instructions.</w:t>
+      </w:r>
+    </w:p>
+    <w:p>
+      <w:pPr>
+        <w:numPr>
+          <w:ilvl w:val="0"/>
+          <w:numId w:val="6"/>
+        </w:numPr>
+      </w:pPr>
+      <w:r>
+        <w:rPr>
+          <w:b/>
+          <w:bCs/>
+        </w:rPr>
+        <w:t>Foreign Linker API (Incubator)</w:t>
+      </w:r>
+      <w:r>
+        <w:t xml:space="preserve"> – Enables Java programs to call native libraries outside the JVM.</w:t>
+      </w:r>
+    </w:p>
+    <w:p>
+      <w:pPr>
+        <w:numPr>
+          <w:ilvl w:val="0"/>
+          <w:numId w:val="6"/>
+        </w:numPr>
+      </w:pPr>
+      <w:r>
+        <w:rPr>
+          <w:b/>
+          <w:bCs/>
+        </w:rPr>
+        <w:t>Foreign Memory Access API (Incubator)</w:t>
+      </w:r>
+      <w:r>
+        <w:t xml:space="preserve"> – Allows safe and efficient access to memory outside the Java heap.</w:t>
+      </w:r>
+    </w:p>
+    <w:p>
+      <w:pPr>
+        <w:numPr>
+          <w:ilvl w:val="0"/>
+          <w:numId w:val="6"/>
+        </w:numPr>
+      </w:pPr>
+      <w:r>
+        <w:rPr>
+          <w:b/>
+          <w:bCs/>
+        </w:rPr>
+        <w:t>JEP 338: Vector API (Second Incubator)</w:t>
+      </w:r>
+      <w:r>
+        <w:t xml:space="preserve"> – Improves support for vectorized computations for better performance.</w:t>
+      </w:r>
+    </w:p>
+    <w:p>
+      <w:pPr>
+        <w:numPr>
+          <w:ilvl w:val="0"/>
+          <w:numId w:val="6"/>
+        </w:numPr>
+      </w:pPr>
+      <w:r>
+        <w:rPr>
+          <w:b/>
+          <w:bCs/>
+        </w:rPr>
+        <w:t>Unix-Domain Socket Channels</w:t>
+      </w:r>
+      <w:r>
+        <w:t xml:space="preserve"> – Adds support for Unix-domain sockets in the NIO channel API for inter-process communication.</w:t>
+      </w:r>
+    </w:p>
+    <w:p>
+      <w:pPr>
+        <w:numPr>
+          <w:ilvl w:val="0"/>
+          <w:numId w:val="6"/>
+        </w:numPr>
+      </w:pPr>
+      <w:r>
+        <w:rPr>
+          <w:b/>
+          <w:bCs/>
+        </w:rPr>
+        <w:t>Strongly Encapsulate JDK Internals by Default</w:t>
+      </w:r>
+      <w:r>
+        <w:t xml:space="preserve"> – Restricts access to internal JDK APIs to improve security and maintainability.</w:t>
+      </w:r>
+    </w:p>
+    <w:p>
+      <w:pPr>
+        <w:numPr>
+          <w:ilvl w:val="0"/>
+          <w:numId w:val="6"/>
+        </w:numPr>
+      </w:pPr>
+      <w:r>
+        <w:rPr>
+          <w:b/>
+          <w:bCs/>
+        </w:rPr>
+        <w:lastRenderedPageBreak/>
+        <w:t>Packaging Tool</w:t>
+      </w:r>
+      <w:r>
+        <w:t xml:space="preserve"> – Provides a standard tool (jpackage) for packaging Java applications into platform-specific installers.</w:t>
+      </w:r>
+    </w:p>
+    <w:p/>
+    <w:p>
+      <w:r>
+        <w:rPr>
+          <w:b/>
+          <w:bCs/>
+        </w:rPr>
+        <w:t>Java 17</w:t>
+      </w:r>
+      <w:r>
+        <w:t xml:space="preserve">, each explained in </w:t>
+      </w:r>
+      <w:r>
+        <w:rPr>
+          <w:b/>
+          <w:bCs/>
+        </w:rPr>
+        <w:t>one short statement</w:t>
+      </w:r>
+      <w:r>
+        <w:t>:</w:t>
+      </w:r>
+    </w:p>
+    <w:p>
+      <w:pPr>
+        <w:numPr>
+          <w:ilvl w:val="0"/>
+          <w:numId w:val="7"/>
+        </w:numPr>
+      </w:pPr>
+      <w:r>
+        <w:rPr>
+          <w:b/>
+          <w:bCs/>
+        </w:rPr>
+        <w:t>Sealed Classes</w:t>
+      </w:r>
+      <w:r>
+        <w:t xml:space="preserve"> – Restrict which classes can extend or implement a class or interface.</w:t>
+      </w:r>
+    </w:p>
+    <w:p>
+      <w:pPr>
+        <w:numPr>
+          <w:ilvl w:val="0"/>
+          <w:numId w:val="7"/>
+        </w:numPr>
+      </w:pPr>
+      <w:r>
+        <w:rPr>
+          <w:b/>
+          <w:bCs/>
+        </w:rPr>
+        <w:t>Pattern Matching for instanceof</w:t>
+      </w:r>
+      <w:r>
+        <w:t xml:space="preserve"> – Combines type checking and casting in a single concise expression.</w:t>
+      </w:r>
+    </w:p>
+    <w:p>
+      <w:pPr>
+        <w:numPr>
+          <w:ilvl w:val="0"/>
+          <w:numId w:val="7"/>
+        </w:numPr>
+      </w:pPr>
+      <w:r>
+        <w:rPr>
+          <w:b/>
+          <w:bCs/>
+        </w:rPr>
+        <w:t>Foreign Function &amp; Memory API (Incubator)</w:t>
+      </w:r>
+      <w:r>
+        <w:t xml:space="preserve"> – Allows Java programs to interact safely with native code and memory outside the JVM.</w:t>
+      </w:r>
+    </w:p>
+    <w:p>
+      <w:pPr>
+        <w:numPr>
+          <w:ilvl w:val="0"/>
+          <w:numId w:val="7"/>
+        </w:numPr>
+      </w:pPr>
+      <w:r>
+        <w:rPr>
+          <w:b/>
+          <w:bCs/>
+        </w:rPr>
+        <w:t>Vector API (Second Incubator)</w:t>
+      </w:r>
+      <w:r>
+        <w:t xml:space="preserve"> – Enables developers to perform vector computations that can leverage modern CPU SIMD instructions.</w:t>
+      </w:r>
+    </w:p>
+    <w:p>
+      <w:pPr>
+        <w:numPr>
+          <w:ilvl w:val="0"/>
+          <w:numId w:val="7"/>
+        </w:numPr>
+      </w:pPr>
+      <w:r>
+        <w:rPr>
+          <w:b/>
+          <w:bCs/>
+        </w:rPr>
+        <w:t>Enhanced Pseudo-Random Number Generators</w:t>
+      </w:r>
+      <w:r>
+        <w:t xml:space="preserve"> – Introduces new interfaces and algorithms for flexible and better random number generation.</w:t>
+      </w:r>
+    </w:p>
+    <w:p>
+      <w:pPr>
+        <w:numPr>
+          <w:ilvl w:val="0"/>
+          <w:numId w:val="7"/>
+        </w:numPr>
+      </w:pPr>
+      <w:r>
+        <w:rPr>
+          <w:b/>
+          <w:bCs/>
+        </w:rPr>
+        <w:t>Strongly Encapsulate JDK Internals</w:t>
+      </w:r>
+      <w:r>
+        <w:t xml:space="preserve"> – Prevents access to internal JDK APIs by default for better security and maintainability.</w:t>
+      </w:r>
+    </w:p>
+    <w:p>
+      <w:pPr>
+        <w:numPr>
+          <w:ilvl w:val="0"/>
+          <w:numId w:val="7"/>
+        </w:numPr>
+      </w:pPr>
+      <w:r>
+        <w:rPr>
+          <w:b/>
+          <w:bCs/>
+        </w:rPr>
+        <w:t>Context-Specific Deserialization Filters</w:t>
+      </w:r>
+      <w:r>
+        <w:t xml:space="preserve"> – Provides better control over deserialization to improve security.</w:t>
+      </w:r>
+    </w:p>
+    <w:p>
+      <w:pPr>
+        <w:numPr>
+          <w:ilvl w:val="0"/>
+          <w:numId w:val="7"/>
+        </w:numPr>
+      </w:pPr>
+      <w:r>
+        <w:rPr>
+          <w:b/>
+          <w:bCs/>
+        </w:rPr>
+        <w:t>Restore Always-Strict Floating-Point Semantics</w:t>
+      </w:r>
+      <w:r>
+        <w:t xml:space="preserve"> – Ensures floating-point calculations always follow strict IEEE 754 rules.</w:t>
+      </w:r>
+    </w:p>
+    <w:p>
+      <w:pPr>
+        <w:numPr>
+          <w:ilvl w:val="0"/>
+          <w:numId w:val="7"/>
+        </w:numPr>
+      </w:pPr>
+      <w:r>
+        <w:rPr>
+          <w:b/>
+          <w:bCs/>
+        </w:rPr>
+        <w:t>Deprecate the Security Manager for Removal</w:t>
+      </w:r>
+      <w:r>
+        <w:t xml:space="preserve"> – Marks the Security Manager for future removal as it is rarely used now.</w:t>
+      </w:r>
+    </w:p>
+    <w:p>
+      <w:pPr>
+        <w:numPr>
+          <w:ilvl w:val="0"/>
+          <w:numId w:val="7"/>
+        </w:numPr>
+      </w:pPr>
+      <w:r>
+        <w:rPr>
+          <w:b/>
+          <w:bCs/>
+        </w:rPr>
+        <w:t>Remove the Experimental AOT and JIT Compiler</w:t>
+      </w:r>
+      <w:r>
+        <w:t xml:space="preserve"> – Eliminates the previously experimental ahead-of-time and JIT compilers from the JDK.</w:t>
+      </w:r>
+    </w:p>
+    <w:p>
+      <w:r>
+        <w:t xml:space="preserve">If you want, I can also show </w:t>
+      </w:r>
+      <w:r>
+        <w:rPr>
+          <w:b/>
+          <w:bCs/>
+        </w:rPr>
+        <w:t>Java 17 features grouped into three categories (Language, JVM, Security)</w:t>
+      </w:r>
+      <w:r>
+        <w:t xml:space="preserve"> which is </w:t>
+      </w:r>
+      <w:r>
+        <w:rPr>
+          <w:b/>
+          <w:bCs/>
+        </w:rPr>
+        <w:t>very useful for interviews</w:t>
+      </w:r>
       <w:r>
         <w:t>.</w:t>
       </w:r>
     </w:p>
-    <w:p>
-      <w:pPr>
-        <w:numPr>
-          <w:ilvl w:val="0"/>
-          <w:numId w:val="1"/>
-        </w:numPr>
-      </w:pPr>
-      <w:r>
-        <w:rPr>
-          <w:b/>
-          <w:bCs/>
-        </w:rPr>
-        <w:t>Local-Variable Syntax for Lambda Parameters</w:t>
-      </w:r>
-      <w:r>
-        <w:t xml:space="preserve"> – Allows the use of var in lambda parameters for improved readability and annotations.</w:t>
-      </w:r>
-    </w:p>
-    <w:p>
-      <w:pPr>
-        <w:numPr>
-          <w:ilvl w:val="0"/>
-          <w:numId w:val="1"/>
-        </w:numPr>
-      </w:pPr>
-      <w:r>
-        <w:rPr>
-          <w:b/>
-          <w:bCs/>
-        </w:rPr>
-        <w:t>Launch Single-File Source-Code Programs</w:t>
-      </w:r>
-      <w:r>
-        <w:t xml:space="preserve"> – Enables running a Java program directly from a .java file without compiling it first.</w:t>
-      </w:r>
-    </w:p>
-    <w:p>
-      <w:pPr>
-        <w:numPr>
-          <w:ilvl w:val="0"/>
-          <w:numId w:val="1"/>
-        </w:numPr>
-      </w:pPr>
-      <w:r>
-        <w:rPr>
-          <w:b/>
-          <w:bCs/>
-        </w:rPr>
-        <w:t>Z Garbage Collector (Experimental)</w:t>
-      </w:r>
-      <w:r>
-        <w:t xml:space="preserve"> – Introduces a scalable low-latency garbage collector designed for large heaps.</w:t>
-      </w:r>
-    </w:p>
-    <w:p>
-      <w:pPr>
-        <w:numPr>
-          <w:ilvl w:val="0"/>
-          <w:numId w:val="1"/>
-        </w:numPr>
-      </w:pPr>
-      <w:r>
-        <w:rPr>
-          <w:b/>
-          <w:bCs/>
-        </w:rPr>
-        <w:t>Epsilon Garbage Collector</w:t>
-      </w:r>
-      <w:r>
-        <w:t xml:space="preserve"> – Adds a no-operation garbage collector used for performance testing and memory benchmarking.</w:t>
-      </w:r>
-    </w:p>
-    <w:p>
-      <w:pPr>
-        <w:numPr>
-          <w:ilvl w:val="0"/>
-          <w:numId w:val="1"/>
-        </w:numPr>
-      </w:pPr>
-      <w:r>
-        <w:rPr>
-          <w:b/>
-          <w:bCs/>
-        </w:rPr>
-        <w:t>Dynamic Class-File Constants</w:t>
-      </w:r>
-      <w:r>
-        <w:t xml:space="preserve"> – Extends the class-file format to support dynamically computed constants.</w:t>
-      </w:r>
-    </w:p>
-    <w:p>
-      <w:pPr>
-        <w:numPr>
-          <w:ilvl w:val="0"/>
-          <w:numId w:val="1"/>
-        </w:numPr>
-      </w:pPr>
-      <w:r>
-        <w:rPr>
-          <w:b/>
-          <w:bCs/>
-        </w:rPr>
-        <w:t>New String Methods</w:t>
-      </w:r>
-      <w:r>
-        <w:t xml:space="preserve"> – Adds useful methods like </w:t>
-      </w:r>
-      <w:proofErr w:type="spellStart"/>
-      <w:proofErr w:type="gramStart"/>
-      <w:r>
-        <w:t>isBlank</w:t>
-      </w:r>
-      <w:proofErr w:type="spellEnd"/>
-      <w:r>
-        <w:t>(</w:t>
-      </w:r>
-      <w:proofErr w:type="gramEnd"/>
-      <w:r>
-        <w:t xml:space="preserve">), </w:t>
-      </w:r>
-      <w:proofErr w:type="gramStart"/>
-      <w:r>
-        <w:t>lines(</w:t>
-      </w:r>
-      <w:proofErr w:type="gramEnd"/>
-      <w:r>
-        <w:t xml:space="preserve">), </w:t>
-      </w:r>
-      <w:proofErr w:type="gramStart"/>
-      <w:r>
-        <w:t>strip(</w:t>
-      </w:r>
-      <w:proofErr w:type="gramEnd"/>
-      <w:r>
-        <w:t xml:space="preserve">), and </w:t>
-      </w:r>
-      <w:proofErr w:type="gramStart"/>
-      <w:r>
-        <w:t>repeat(</w:t>
-      </w:r>
-      <w:proofErr w:type="gramEnd"/>
-      <w:r>
-        <w:t>) to the String class.</w:t>
-      </w:r>
-    </w:p>
-    <w:p>
-      <w:pPr>
-        <w:numPr>
-          <w:ilvl w:val="0"/>
-          <w:numId w:val="1"/>
-        </w:numPr>
-      </w:pPr>
-      <w:r>
-        <w:rPr>
-          <w:b/>
-          <w:bCs/>
-        </w:rPr>
-        <w:t>New File Methods</w:t>
-      </w:r>
-      <w:r>
-        <w:t xml:space="preserve"> – Introduces methods such as </w:t>
-      </w:r>
-      <w:proofErr w:type="spellStart"/>
-      <w:proofErr w:type="gramStart"/>
-      <w:r>
-        <w:t>readString</w:t>
-      </w:r>
-      <w:proofErr w:type="spellEnd"/>
-      <w:r>
-        <w:t>(</w:t>
-      </w:r>
-      <w:proofErr w:type="gramEnd"/>
-      <w:r>
-        <w:t xml:space="preserve">) and </w:t>
-      </w:r>
-      <w:proofErr w:type="spellStart"/>
-      <w:proofErr w:type="gramStart"/>
-      <w:r>
-        <w:t>writeString</w:t>
-      </w:r>
-      <w:proofErr w:type="spellEnd"/>
-      <w:r>
-        <w:t>(</w:t>
-      </w:r>
-      <w:proofErr w:type="gramEnd"/>
-      <w:r>
-        <w:t>) in the Files API.</w:t>
-      </w:r>
-    </w:p>
-    <w:p>
-      <w:pPr>
-        <w:numPr>
-          <w:ilvl w:val="0"/>
-          <w:numId w:val="1"/>
-        </w:numPr>
-      </w:pPr>
-      <w:r>
-        <w:rPr>
-          <w:b/>
-          <w:bCs/>
-        </w:rPr>
-        <w:t>Nest-Based Access Control</w:t>
-      </w:r>
-      <w:r>
-        <w:t xml:space="preserve"> – Allows nested classes to access each other's private members more efficiently.</w:t>
-      </w:r>
-    </w:p>
-    <w:p>
-      <w:pPr>
-        <w:numPr>
-          <w:ilvl w:val="0"/>
-          <w:numId w:val="1"/>
-        </w:numPr>
-      </w:pPr>
-      <w:r>
-        <w:rPr>
-          <w:b/>
-          <w:bCs/>
-        </w:rPr>
-        <w:t>Remove Java EE and CORBA Modules</w:t>
-      </w:r>
-      <w:r>
-        <w:t xml:space="preserve"> – Removes deprecated Java EE and CORBA modules from the JDK.</w:t>
-      </w:r>
-    </w:p>
-    <w:p/>
-    <w:p/>
-    <w:p/>
-    <w:p/>
-    <w:p/>
-    <w:p>
+    <w:p/>
+    <w:p/>
+    <w:p/>
+    <w:p/>
+    <w:p>
+      <w:r>
+        <w:rPr>
+          <w:b/>
+          <w:bCs/>
+        </w:rPr>
+        <w:t>Java 21</w:t>
+      </w:r>
+      <w:r>
+        <w:t xml:space="preserve">, each explained in </w:t>
+      </w:r>
+      <w:r>
+        <w:rPr>
+          <w:b/>
+          <w:bCs/>
+        </w:rPr>
+        <w:t>one short statement</w:t>
+      </w:r>
+      <w:r>
+        <w:t>:</w:t>
+      </w:r>
+    </w:p>
+    <w:p>
+      <w:pPr>
+        <w:numPr>
+          <w:ilvl w:val="0"/>
+          <w:numId w:val="8"/>
+        </w:numPr>
+      </w:pPr>
       <w:r>
         <w:rPr>
           <w:b/>
           <w:bCs/>
         </w:rPr>
         <w:lastRenderedPageBreak/>
-        <w:t>Java 12</w:t>
-      </w:r>
-      <w:r>
-        <w:t xml:space="preserve">, each in </w:t>
-      </w:r>
-      <w:r>
-        <w:rPr>
-          <w:b/>
-          <w:bCs/>
-        </w:rPr>
-        <w:t>one single statement</w:t>
-      </w:r>
-      <w:r>
-        <w:t>:</w:t>
-      </w:r>
-    </w:p>
-    <w:p>
-      <w:pPr>
-        <w:numPr>
-          <w:ilvl w:val="0"/>
-          <w:numId w:val="2"/>
-        </w:numPr>
-      </w:pPr>
-      <w:r>
-        <w:rPr>
-          <w:b/>
-          <w:bCs/>
-        </w:rPr>
-        <w:t>Switch Expressions (Preview)</w:t>
-      </w:r>
-      <w:r>
-        <w:t xml:space="preserve"> – Enhances the switch statement to return values and use the arrow (-&gt;) syntax.</w:t>
-      </w:r>
-    </w:p>
-    <w:p>
-      <w:pPr>
-        <w:numPr>
-          <w:ilvl w:val="0"/>
-          <w:numId w:val="2"/>
-        </w:numPr>
-      </w:pPr>
-      <w:r>
-        <w:rPr>
-          <w:b/>
-          <w:bCs/>
-        </w:rPr>
-        <w:t>Shenandoah Garbage Collector (Experimental)</w:t>
-      </w:r>
-      <w:r>
-        <w:t xml:space="preserve"> – Introduces a low-pause-time garbage collector designed to reduce GC pause times.</w:t>
-      </w:r>
-    </w:p>
-    <w:p>
-      <w:pPr>
-        <w:numPr>
-          <w:ilvl w:val="0"/>
-          <w:numId w:val="2"/>
-        </w:numPr>
-      </w:pPr>
-      <w:r>
-        <w:rPr>
-          <w:b/>
-          <w:bCs/>
-        </w:rPr>
-        <w:t>JVM Constants API</w:t>
-      </w:r>
-      <w:r>
-        <w:t xml:space="preserve"> – Provides an API to model nominal descriptions of key class-file and runtime artifacts.</w:t>
-      </w:r>
-    </w:p>
-    <w:p>
-      <w:pPr>
-        <w:numPr>
-          <w:ilvl w:val="0"/>
-          <w:numId w:val="2"/>
-        </w:numPr>
-      </w:pPr>
-      <w:r>
-        <w:rPr>
-          <w:b/>
-          <w:bCs/>
-        </w:rPr>
-        <w:t>One AArch64 Port (ARM64)</w:t>
-      </w:r>
-      <w:r>
-        <w:t xml:space="preserve"> – Unifies the two existing ARM64 ports into a single supported implementation.</w:t>
-      </w:r>
-    </w:p>
-    <w:p>
-      <w:pPr>
-        <w:numPr>
-          <w:ilvl w:val="0"/>
-          <w:numId w:val="2"/>
-        </w:numPr>
-      </w:pPr>
-      <w:r>
-        <w:rPr>
-          <w:b/>
-          <w:bCs/>
-        </w:rPr>
-        <w:t>Default CDS Archives</w:t>
-      </w:r>
-      <w:r>
-        <w:t xml:space="preserve"> – Improves application startup time by including default class data sharing archives.</w:t>
-      </w:r>
-    </w:p>
-    <w:p>
-      <w:pPr>
-        <w:numPr>
-          <w:ilvl w:val="0"/>
-          <w:numId w:val="2"/>
-        </w:numPr>
-      </w:pPr>
-      <w:r>
-        <w:rPr>
-          <w:b/>
-          <w:bCs/>
-        </w:rPr>
-        <w:t>Abortable Mixed Collections for G1</w:t>
-      </w:r>
-      <w:r>
-        <w:t xml:space="preserve"> – Improves the G1 Garbage Collector by allowing mixed collections to be aborted if they exceed pause time targets.</w:t>
-      </w:r>
-    </w:p>
-    <w:p>
-      <w:pPr>
-        <w:numPr>
-          <w:ilvl w:val="0"/>
-          <w:numId w:val="2"/>
-        </w:numPr>
-      </w:pPr>
-      <w:r>
-        <w:rPr>
-          <w:b/>
-          <w:bCs/>
-        </w:rPr>
-        <w:t>Promptly Return Unused Committed Memory from G1</w:t>
-      </w:r>
-      <w:r>
-        <w:t xml:space="preserve"> – Enables G1 to release unused memory back to the operating system more quickly.</w:t>
-      </w:r>
-    </w:p>
-    <w:p/>
-    <w:p/>
-    <w:p/>
-    <w:p/>
-    <w:p>
-      <w:r>
-        <w:rPr>
-          <w:b/>
-          <w:bCs/>
-        </w:rPr>
-        <w:t>Java 13</w:t>
-      </w:r>
-      <w:r>
-        <w:t xml:space="preserve">, each in </w:t>
-      </w:r>
-      <w:r>
-        <w:rPr>
-          <w:b/>
-          <w:bCs/>
-        </w:rPr>
-        <w:t>one single statement</w:t>
-      </w:r>
-      <w:r>
-        <w:t>:</w:t>
-      </w:r>
-    </w:p>
-    <w:p>
-      <w:pPr>
-        <w:numPr>
-          <w:ilvl w:val="0"/>
-          <w:numId w:val="3"/>
-        </w:numPr>
-      </w:pPr>
-      <w:r>
-        <w:rPr>
-          <w:b/>
-          <w:bCs/>
-        </w:rPr>
-        <w:t>Text Blocks (Preview)</w:t>
-      </w:r>
-      <w:r>
-        <w:t xml:space="preserve"> – Introduces multi-line string literals using triple quotes (""") for improved readability.</w:t>
-      </w:r>
-    </w:p>
-    <w:p>
-      <w:pPr>
-        <w:numPr>
-          <w:ilvl w:val="0"/>
-          <w:numId w:val="3"/>
-        </w:numPr>
-      </w:pPr>
-      <w:r>
-        <w:rPr>
-          <w:b/>
-          <w:bCs/>
-        </w:rPr>
-        <w:t>Switch Expressions (Second Preview)</w:t>
-      </w:r>
-      <w:r>
-        <w:t xml:space="preserve"> – Enhances the switch statement to return values and use the arrow (-&gt;) syntax.</w:t>
-      </w:r>
-    </w:p>
-    <w:p>
-      <w:pPr>
-        <w:numPr>
-          <w:ilvl w:val="0"/>
-          <w:numId w:val="3"/>
-        </w:numPr>
-      </w:pPr>
-      <w:r>
-        <w:rPr>
-          <w:b/>
-          <w:bCs/>
-        </w:rPr>
-        <w:t>Dynamic CDS Archives</w:t>
-      </w:r>
-      <w:r>
-        <w:t xml:space="preserve"> – Improves application startup time by automatically generating class data sharing archives.</w:t>
-      </w:r>
-    </w:p>
-    <w:p>
-      <w:pPr>
-        <w:numPr>
-          <w:ilvl w:val="0"/>
-          <w:numId w:val="3"/>
-        </w:numPr>
-      </w:pPr>
-      <w:r>
-        <w:rPr>
-          <w:b/>
-          <w:bCs/>
-        </w:rPr>
-        <w:t>ZGC: Uncommit Unused Memory</w:t>
-      </w:r>
-      <w:r>
-        <w:t xml:space="preserve"> – Allows the Z Garbage Collector to return unused heap memory to the operating system.</w:t>
-      </w:r>
-    </w:p>
-    <w:p>
-      <w:pPr>
-        <w:numPr>
-          <w:ilvl w:val="0"/>
-          <w:numId w:val="3"/>
-        </w:numPr>
-      </w:pPr>
-      <w:r>
-        <w:rPr>
-          <w:b/>
-          <w:bCs/>
-        </w:rPr>
-        <w:t>Reimplement the Legacy Socket API</w:t>
-      </w:r>
-      <w:r>
-        <w:t xml:space="preserve"> – Rewrites the old socket implementation with a simpler and more maintainable design.</w:t>
-      </w:r>
-    </w:p>
-    <w:p/>
-    <w:p/>
-    <w:p>
-      <w:r>
-        <w:rPr>
-          <w:b/>
-          <w:bCs/>
-        </w:rPr>
-        <w:lastRenderedPageBreak/>
-        <w:t>Java 14</w:t>
-      </w:r>
-      <w:r>
-        <w:t xml:space="preserve">, each in </w:t>
-      </w:r>
-      <w:r>
-        <w:rPr>
-          <w:b/>
-          <w:bCs/>
-        </w:rPr>
-        <w:t>one single statement</w:t>
-      </w:r>
-      <w:r>
-        <w:t>:</w:t>
-      </w:r>
-    </w:p>
-    <w:p>
-      <w:pPr>
-        <w:numPr>
-          <w:ilvl w:val="0"/>
-          <w:numId w:val="4"/>
-        </w:numPr>
-      </w:pPr>
-      <w:r>
-        <w:rPr>
-          <w:b/>
-          <w:bCs/>
-        </w:rPr>
-        <w:t>Switch Expressions (Standard)</w:t>
-      </w:r>
-      <w:r>
-        <w:t xml:space="preserve"> – Allows switch to return values using a concise arrow (-&gt;) syntax.</w:t>
-      </w:r>
-    </w:p>
-    <w:p>
-      <w:pPr>
-        <w:numPr>
-          <w:ilvl w:val="0"/>
-          <w:numId w:val="4"/>
-        </w:numPr>
-      </w:pPr>
-      <w:r>
-        <w:rPr>
-          <w:b/>
-          <w:bCs/>
-        </w:rPr>
-        <w:t>Records (Preview)</w:t>
-      </w:r>
-      <w:r>
-        <w:t xml:space="preserve"> – Introduces a compact syntax for declaring immutable data carrier classes.</w:t>
-      </w:r>
-    </w:p>
-    <w:p>
-      <w:pPr>
-        <w:numPr>
-          <w:ilvl w:val="0"/>
-          <w:numId w:val="4"/>
-        </w:numPr>
-      </w:pPr>
-      <w:r>
-        <w:rPr>
-          <w:b/>
-          <w:bCs/>
-        </w:rPr>
-        <w:t xml:space="preserve">Pattern Matching for </w:t>
-      </w:r>
-      <w:proofErr w:type="spellStart"/>
-      <w:r>
-        <w:rPr>
-          <w:b/>
-          <w:bCs/>
-        </w:rPr>
-        <w:t>instanceof</w:t>
-      </w:r>
-      <w:proofErr w:type="spellEnd"/>
-      <w:r>
-        <w:rPr>
-          <w:b/>
-          <w:bCs/>
-        </w:rPr>
-        <w:t xml:space="preserve"> (Preview)</w:t>
-      </w:r>
-      <w:r>
-        <w:t xml:space="preserve"> – Simplifies type checking and casting into a single expression.</w:t>
-      </w:r>
-    </w:p>
-    <w:p>
-      <w:pPr>
-        <w:numPr>
-          <w:ilvl w:val="0"/>
-          <w:numId w:val="4"/>
-        </w:numPr>
-      </w:pPr>
-      <w:r>
-        <w:rPr>
-          <w:b/>
-          <w:bCs/>
-        </w:rPr>
-        <w:t xml:space="preserve">Helpful </w:t>
-      </w:r>
-      <w:proofErr w:type="spellStart"/>
-      <w:r>
-        <w:rPr>
-          <w:b/>
-          <w:bCs/>
-        </w:rPr>
-        <w:t>NullPointerExceptions</w:t>
-      </w:r>
-      <w:proofErr w:type="spellEnd"/>
-      <w:r>
-        <w:t xml:space="preserve"> – Provides detailed messages explaining exactly which variable was null.</w:t>
-      </w:r>
-    </w:p>
-    <w:p>
-      <w:pPr>
-        <w:numPr>
-          <w:ilvl w:val="0"/>
-          <w:numId w:val="4"/>
-        </w:numPr>
-      </w:pPr>
-      <w:r>
-        <w:rPr>
-          <w:b/>
-          <w:bCs/>
-        </w:rPr>
-        <w:t>Text Blocks (Second Preview)</w:t>
-      </w:r>
-      <w:r>
-        <w:t xml:space="preserve"> – Enables writing multi-line string literals using triple quotes.</w:t>
-      </w:r>
-    </w:p>
-    <w:p>
-      <w:pPr>
-        <w:numPr>
-          <w:ilvl w:val="0"/>
-          <w:numId w:val="4"/>
-        </w:numPr>
-      </w:pPr>
-      <w:r>
-        <w:rPr>
-          <w:b/>
-          <w:bCs/>
-        </w:rPr>
-        <w:t>Foreign-Memory Access API (Incubator)</w:t>
-      </w:r>
-      <w:r>
-        <w:t xml:space="preserve"> – Allows safe and efficient access to memory outside the Java heap.</w:t>
-      </w:r>
-    </w:p>
-    <w:p>
-      <w:pPr>
-        <w:numPr>
-          <w:ilvl w:val="0"/>
-          <w:numId w:val="4"/>
-        </w:numPr>
-      </w:pPr>
-      <w:r>
-        <w:rPr>
-          <w:b/>
-          <w:bCs/>
-        </w:rPr>
-        <w:t>Packaging Tool (Incubator)</w:t>
-      </w:r>
-      <w:r>
-        <w:t xml:space="preserve"> – Introduces </w:t>
-      </w:r>
-      <w:proofErr w:type="spellStart"/>
-      <w:r>
-        <w:t>jpackage</w:t>
-      </w:r>
-      <w:proofErr w:type="spellEnd"/>
-      <w:r>
-        <w:t xml:space="preserve"> to create native installers for Java applications.</w:t>
-      </w:r>
-    </w:p>
-    <w:p>
-      <w:pPr>
-        <w:numPr>
-          <w:ilvl w:val="0"/>
-          <w:numId w:val="4"/>
-        </w:numPr>
-      </w:pPr>
-      <w:r>
-        <w:rPr>
-          <w:b/>
-          <w:bCs/>
-        </w:rPr>
-        <w:t>NUMA-Aware Memory Allocation for G1</w:t>
-      </w:r>
-      <w:r>
-        <w:t xml:space="preserve"> – Improves performance by optimizing memory allocation on NUMA architectures.</w:t>
-      </w:r>
-    </w:p>
-    <w:p>
-      <w:pPr>
-        <w:numPr>
-          <w:ilvl w:val="0"/>
-          <w:numId w:val="4"/>
-        </w:numPr>
-      </w:pPr>
-      <w:r>
-        <w:rPr>
-          <w:b/>
-          <w:bCs/>
-        </w:rPr>
-        <w:t>ZGC on macOS and Windows</w:t>
-      </w:r>
-      <w:r>
-        <w:t xml:space="preserve"> – Extends support for the Z Garbage Collector to macOS and Windows.</w:t>
-      </w:r>
-    </w:p>
-    <w:p>
-      <w:pPr>
-        <w:numPr>
-          <w:ilvl w:val="0"/>
-          <w:numId w:val="4"/>
-        </w:numPr>
-      </w:pPr>
-      <w:r>
-        <w:rPr>
-          <w:b/>
-          <w:bCs/>
-        </w:rPr>
-        <w:t>Remove the CMS Garbage Collector</w:t>
-      </w:r>
-      <w:r>
-        <w:t xml:space="preserve"> – Removes the deprecated Concurrent Mark Sweep (CMS) garbage collector.</w:t>
-      </w:r>
-    </w:p>
-    <w:p/>
-    <w:p/>
-    <w:p>
-      <w:r>
-        <w:rPr>
-          <w:b/>
-          <w:bCs/>
-        </w:rPr>
-        <w:t>Java 15</w:t>
-      </w:r>
-      <w:r>
-        <w:t xml:space="preserve">, each in </w:t>
-      </w:r>
-      <w:r>
-        <w:rPr>
-          <w:b/>
-          <w:bCs/>
-        </w:rPr>
-        <w:t>one single statement</w:t>
-      </w:r>
-      <w:r>
-        <w:t>:</w:t>
-      </w:r>
-    </w:p>
-    <w:p>
-      <w:pPr>
-        <w:numPr>
-          <w:ilvl w:val="0"/>
-          <w:numId w:val="5"/>
-        </w:numPr>
-      </w:pPr>
-      <w:r>
-        <w:rPr>
-          <w:b/>
-          <w:bCs/>
-        </w:rPr>
-        <w:t>Text Blocks (Standard)</w:t>
-      </w:r>
-      <w:r>
-        <w:t xml:space="preserve"> – Provides a multi-line string syntax using triple quotes to write readable string literals.</w:t>
-      </w:r>
-    </w:p>
-    <w:p>
-      <w:pPr>
-        <w:numPr>
-          <w:ilvl w:val="0"/>
-          <w:numId w:val="5"/>
-        </w:numPr>
-      </w:pPr>
-      <w:r>
-        <w:rPr>
-          <w:b/>
-          <w:bCs/>
-        </w:rPr>
-        <w:t>Sealed Classes (Preview)</w:t>
-      </w:r>
-      <w:r>
-        <w:t xml:space="preserve"> – Restricts which classes can extend or implement a class or interface.</w:t>
-      </w:r>
-    </w:p>
-    <w:p>
-      <w:pPr>
-        <w:numPr>
-          <w:ilvl w:val="0"/>
-          <w:numId w:val="5"/>
-        </w:numPr>
-      </w:pPr>
-      <w:r>
-        <w:rPr>
-          <w:b/>
-          <w:bCs/>
-        </w:rPr>
-        <w:t>Hidden Classes</w:t>
-      </w:r>
-      <w:r>
-        <w:t xml:space="preserve"> – Introduces classes that are not discoverable and are mainly used by frameworks that generate classes dynamically.</w:t>
-      </w:r>
-    </w:p>
-    <w:p>
-      <w:pPr>
-        <w:numPr>
-          <w:ilvl w:val="0"/>
-          <w:numId w:val="5"/>
-        </w:numPr>
-      </w:pPr>
-      <w:r>
-        <w:rPr>
-          <w:b/>
-          <w:bCs/>
-        </w:rPr>
-        <w:t xml:space="preserve">Pattern Matching for </w:t>
-      </w:r>
-      <w:proofErr w:type="spellStart"/>
-      <w:r>
-        <w:rPr>
-          <w:b/>
-          <w:bCs/>
-        </w:rPr>
-        <w:t>instanceof</w:t>
-      </w:r>
-      <w:proofErr w:type="spellEnd"/>
-      <w:r>
-        <w:rPr>
-          <w:b/>
-          <w:bCs/>
-        </w:rPr>
-        <w:t xml:space="preserve"> (Second Preview)</w:t>
-      </w:r>
-      <w:r>
-        <w:t xml:space="preserve"> – Simplifies type checking and casting into a single concise expression.</w:t>
-      </w:r>
-    </w:p>
-    <w:p>
-      <w:pPr>
-        <w:numPr>
-          <w:ilvl w:val="0"/>
-          <w:numId w:val="5"/>
-        </w:numPr>
-      </w:pPr>
-      <w:r>
-        <w:rPr>
-          <w:b/>
-          <w:bCs/>
-        </w:rPr>
-        <w:lastRenderedPageBreak/>
-        <w:t>Records (Second Preview)</w:t>
-      </w:r>
-      <w:r>
-        <w:t xml:space="preserve"> – Provides a concise syntax for defining immutable data carrier classes.</w:t>
-      </w:r>
-    </w:p>
-    <w:p>
-      <w:pPr>
-        <w:numPr>
-          <w:ilvl w:val="0"/>
-          <w:numId w:val="5"/>
-        </w:numPr>
-      </w:pPr>
-      <w:r>
-        <w:rPr>
-          <w:b/>
-          <w:bCs/>
-        </w:rPr>
-        <w:t>Foreign-Memory Access API (Second Incubator)</w:t>
-      </w:r>
-      <w:r>
-        <w:t xml:space="preserve"> – Allows Java programs to safely access memory outside the Java heap.</w:t>
-      </w:r>
-    </w:p>
-    <w:p/>
-    <w:p>
-      <w:pPr>
-        <w:numPr>
-          <w:ilvl w:val="0"/>
-          <w:numId w:val="5"/>
-        </w:numPr>
-      </w:pPr>
-      <w:r>
-        <w:rPr>
-          <w:b/>
-          <w:bCs/>
-        </w:rPr>
-        <w:t>Edwards-Curve Digital Signature Algorithm (</w:t>
-      </w:r>
-      <w:proofErr w:type="spellStart"/>
-      <w:r>
-        <w:rPr>
-          <w:b/>
-          <w:bCs/>
-        </w:rPr>
-        <w:t>EdDSA</w:t>
-      </w:r>
-      <w:proofErr w:type="spellEnd"/>
-      <w:r>
-        <w:rPr>
-          <w:b/>
-          <w:bCs/>
-        </w:rPr>
-        <w:t>)</w:t>
-      </w:r>
-      <w:r>
-        <w:t xml:space="preserve"> – Adds support for modern cryptographic digital signature algorithms.</w:t>
-      </w:r>
-    </w:p>
-    <w:p>
-      <w:pPr>
-        <w:numPr>
-          <w:ilvl w:val="0"/>
-          <w:numId w:val="5"/>
-        </w:numPr>
-      </w:pPr>
-      <w:r>
-        <w:rPr>
-          <w:b/>
-          <w:bCs/>
-        </w:rPr>
-        <w:t>ZGC Improvements</w:t>
-      </w:r>
-      <w:r>
-        <w:t xml:space="preserve"> – Enhances the Z Garbage Collector to support production use with better performance.</w:t>
-      </w:r>
-    </w:p>
-    <w:p>
-      <w:pPr>
-        <w:numPr>
-          <w:ilvl w:val="0"/>
-          <w:numId w:val="5"/>
-        </w:numPr>
-      </w:pPr>
-      <w:r>
-        <w:rPr>
-          <w:b/>
-          <w:bCs/>
-        </w:rPr>
-        <w:t>Shenandoah Garbage Collector (Production)</w:t>
-      </w:r>
-      <w:r>
-        <w:t xml:space="preserve"> – Introduces a low-pause-time garbage collector for improved application responsiveness.</w:t>
-      </w:r>
-    </w:p>
-    <w:p>
-      <w:pPr>
-        <w:numPr>
-          <w:ilvl w:val="0"/>
-          <w:numId w:val="5"/>
-        </w:numPr>
-      </w:pPr>
-      <w:r>
-        <w:rPr>
-          <w:b/>
-          <w:bCs/>
-        </w:rPr>
-        <w:t>Remove Nashorn JavaScript Engine</w:t>
-      </w:r>
-      <w:r>
-        <w:t xml:space="preserve"> – Removes the deprecated </w:t>
-      </w:r>
-      <w:proofErr w:type="spellStart"/>
-      <w:r>
-        <w:t>Nashorn</w:t>
-      </w:r>
-      <w:proofErr w:type="spellEnd"/>
-      <w:r>
-        <w:t xml:space="preserve"> JavaScript engine from the JDK.</w:t>
-      </w:r>
-    </w:p>
-    <w:p/>
-    <w:p/>
-    <w:p>
-      <w:r>
-        <w:rPr>
-          <w:b/>
-          <w:bCs/>
-        </w:rPr>
-        <w:t>Java 16</w:t>
-      </w:r>
-      <w:r>
-        <w:t xml:space="preserve">, each in </w:t>
-      </w:r>
-      <w:r>
-        <w:rPr>
-          <w:b/>
-          <w:bCs/>
-        </w:rPr>
-        <w:t>one single statement</w:t>
-      </w:r>
-      <w:r>
-        <w:t>:</w:t>
-      </w:r>
-    </w:p>
-    <w:p>
-      <w:pPr>
-        <w:numPr>
-          <w:ilvl w:val="0"/>
-          <w:numId w:val="6"/>
-        </w:numPr>
-      </w:pPr>
-      <w:r>
-        <w:rPr>
-          <w:b/>
-          <w:bCs/>
-        </w:rPr>
-        <w:t>Records</w:t>
-      </w:r>
-      <w:r>
-        <w:t xml:space="preserve"> – Introduces a compact syntax for declaring immutable data carrier classes.</w:t>
-      </w:r>
-    </w:p>
-    <w:p>
-      <w:pPr>
-        <w:numPr>
-          <w:ilvl w:val="0"/>
-          <w:numId w:val="6"/>
-        </w:numPr>
-      </w:pPr>
-      <w:r>
-        <w:rPr>
-          <w:b/>
-          <w:bCs/>
-        </w:rPr>
-        <w:t xml:space="preserve">Pattern Matching for </w:t>
-      </w:r>
-      <w:proofErr w:type="spellStart"/>
-      <w:r>
-        <w:rPr>
-          <w:b/>
-          <w:bCs/>
-        </w:rPr>
-        <w:t>instanceof</w:t>
-      </w:r>
-      <w:proofErr w:type="spellEnd"/>
-      <w:r>
-        <w:t xml:space="preserve"> – Simplifies type checking and casting in a single operation.</w:t>
-      </w:r>
-    </w:p>
-    <w:p>
-      <w:pPr>
-        <w:numPr>
-          <w:ilvl w:val="0"/>
-          <w:numId w:val="6"/>
-        </w:numPr>
-      </w:pPr>
-      <w:r>
-        <w:rPr>
-          <w:b/>
-          <w:bCs/>
-        </w:rPr>
-        <w:t>Sealed Classes (Preview)</w:t>
-      </w:r>
-      <w:r>
-        <w:t xml:space="preserve"> – Allows restricting which classes can extend or implement a class or interface.</w:t>
-      </w:r>
-    </w:p>
-    <w:p>
-      <w:pPr>
-        <w:numPr>
-          <w:ilvl w:val="0"/>
-          <w:numId w:val="6"/>
-        </w:numPr>
-      </w:pPr>
-      <w:r>
-        <w:rPr>
-          <w:b/>
-          <w:bCs/>
-        </w:rPr>
-        <w:t>Vector API (Incubator)</w:t>
-      </w:r>
-      <w:r>
-        <w:t xml:space="preserve"> – Provides an API for performing vector computations that utilize modern CPU SIMD instructions.</w:t>
-      </w:r>
-    </w:p>
-    <w:p>
-      <w:pPr>
-        <w:numPr>
-          <w:ilvl w:val="0"/>
-          <w:numId w:val="6"/>
-        </w:numPr>
-      </w:pPr>
-      <w:r>
-        <w:rPr>
-          <w:b/>
-          <w:bCs/>
-        </w:rPr>
-        <w:t>Foreign Linker API (Incubator)</w:t>
-      </w:r>
-      <w:r>
-        <w:t xml:space="preserve"> – Enables Java programs to call native libraries outside the JVM.</w:t>
-      </w:r>
-    </w:p>
-    <w:p>
-      <w:pPr>
-        <w:numPr>
-          <w:ilvl w:val="0"/>
-          <w:numId w:val="6"/>
-        </w:numPr>
-      </w:pPr>
-      <w:r>
-        <w:rPr>
-          <w:b/>
-          <w:bCs/>
-        </w:rPr>
-        <w:t>Foreign Memory Access API (Incubator)</w:t>
-      </w:r>
-      <w:r>
-        <w:t xml:space="preserve"> – Allows safe and efficient access to memory outside the Java heap.</w:t>
-      </w:r>
-    </w:p>
-    <w:p>
-      <w:pPr>
-        <w:numPr>
-          <w:ilvl w:val="0"/>
-          <w:numId w:val="6"/>
-        </w:numPr>
-      </w:pPr>
-      <w:r>
-        <w:rPr>
-          <w:b/>
-          <w:bCs/>
-        </w:rPr>
-        <w:t>JEP 338: Vector API (Second Incubator)</w:t>
-      </w:r>
-      <w:r>
-        <w:t xml:space="preserve"> – Improves support for vectorized computations for better performance.</w:t>
-      </w:r>
-    </w:p>
-    <w:p>
-      <w:pPr>
-        <w:numPr>
-          <w:ilvl w:val="0"/>
-          <w:numId w:val="6"/>
-        </w:numPr>
-      </w:pPr>
-      <w:r>
-        <w:rPr>
-          <w:b/>
-          <w:bCs/>
-        </w:rPr>
-        <w:t>Unix-Domain Socket Channels</w:t>
-      </w:r>
-      <w:r>
-        <w:t xml:space="preserve"> – Adds support for Unix-domain sockets in the NIO channel API for inter-process communication.</w:t>
-      </w:r>
-    </w:p>
-    <w:p>
-      <w:pPr>
-        <w:numPr>
-          <w:ilvl w:val="0"/>
-          <w:numId w:val="6"/>
-        </w:numPr>
-      </w:pPr>
-      <w:r>
-        <w:rPr>
-          <w:b/>
-          <w:bCs/>
-        </w:rPr>
-        <w:lastRenderedPageBreak/>
-        <w:t>Strongly Encapsulate JDK Internals by Default</w:t>
-      </w:r>
-      <w:r>
-        <w:t xml:space="preserve"> – Restricts access to internal JDK APIs to improve security and maintainability.</w:t>
-      </w:r>
-    </w:p>
-    <w:p>
-      <w:pPr>
-        <w:numPr>
-          <w:ilvl w:val="0"/>
-          <w:numId w:val="6"/>
-        </w:numPr>
-      </w:pPr>
-      <w:r>
-        <w:rPr>
-          <w:b/>
-          <w:bCs/>
-        </w:rPr>
-        <w:t>Packaging Tool</w:t>
-      </w:r>
-      <w:r>
-        <w:t xml:space="preserve"> – Provides a standard tool (</w:t>
-      </w:r>
-      <w:proofErr w:type="spellStart"/>
-      <w:r>
-        <w:t>jpackage</w:t>
-      </w:r>
-      <w:proofErr w:type="spellEnd"/>
-      <w:r>
-        <w:t>) for packaging Java applications into platform-specific installers.</w:t>
-      </w:r>
-    </w:p>
-    <w:p/>
-    <w:p>
-      <w:r>
-        <w:rPr>
-          <w:b/>
-          <w:bCs/>
-        </w:rPr>
-        <w:t>Java 17</w:t>
-      </w:r>
-      <w:r>
-        <w:t xml:space="preserve">, each explained in </w:t>
-      </w:r>
-      <w:r>
-        <w:rPr>
-          <w:b/>
-          <w:bCs/>
-        </w:rPr>
-        <w:t>one short statement</w:t>
-      </w:r>
-      <w:r>
-        <w:t>:</w:t>
-      </w:r>
-    </w:p>
-    <w:p>
-      <w:pPr>
-        <w:numPr>
-          <w:ilvl w:val="0"/>
-          <w:numId w:val="7"/>
-        </w:numPr>
-      </w:pPr>
-      <w:r>
-        <w:rPr>
-          <w:b/>
-          <w:bCs/>
-        </w:rPr>
-        <w:t>Sealed Classes</w:t>
-      </w:r>
-      <w:r>
-        <w:t xml:space="preserve"> – Restrict which classes can extend or implement a class or interface.</w:t>
-      </w:r>
-    </w:p>
-    <w:p>
-      <w:pPr>
-        <w:numPr>
-          <w:ilvl w:val="0"/>
-          <w:numId w:val="7"/>
-        </w:numPr>
-      </w:pPr>
-      <w:r>
-        <w:rPr>
-          <w:b/>
-          <w:bCs/>
-        </w:rPr>
-        <w:t xml:space="preserve">Pattern Matching for </w:t>
-      </w:r>
-      <w:proofErr w:type="spellStart"/>
-      <w:r>
-        <w:rPr>
-          <w:b/>
-          <w:bCs/>
-        </w:rPr>
-        <w:t>instanceof</w:t>
-      </w:r>
-      <w:proofErr w:type="spellEnd"/>
-      <w:r>
-        <w:t xml:space="preserve"> – Combines type checking and casting in a single concise expression.</w:t>
-      </w:r>
-    </w:p>
-    <w:p>
-      <w:pPr>
-        <w:numPr>
-          <w:ilvl w:val="0"/>
-          <w:numId w:val="7"/>
-        </w:numPr>
-      </w:pPr>
-      <w:r>
-        <w:rPr>
-          <w:b/>
-          <w:bCs/>
-        </w:rPr>
-        <w:t>Foreign Function &amp; Memory API (Incubator)</w:t>
-      </w:r>
-      <w:r>
-        <w:t xml:space="preserve"> – Allows Java programs to interact safely with native code and memory outside the JVM.</w:t>
-      </w:r>
-    </w:p>
-    <w:p>
-      <w:pPr>
-        <w:numPr>
-          <w:ilvl w:val="0"/>
-          <w:numId w:val="7"/>
-        </w:numPr>
-      </w:pPr>
-      <w:r>
-        <w:rPr>
-          <w:b/>
-          <w:bCs/>
-        </w:rPr>
-        <w:t>Vector API (Second Incubator)</w:t>
-      </w:r>
-      <w:r>
-        <w:t xml:space="preserve"> – Enables developers to perform vector computations that can leverage modern CPU SIMD instructions.</w:t>
-      </w:r>
-    </w:p>
-    <w:p>
-      <w:pPr>
-        <w:numPr>
-          <w:ilvl w:val="0"/>
-          <w:numId w:val="7"/>
-        </w:numPr>
-      </w:pPr>
-      <w:r>
-        <w:rPr>
-          <w:b/>
-          <w:bCs/>
-        </w:rPr>
-        <w:t>Enhanced Pseudo-Random Number Generators</w:t>
-      </w:r>
-      <w:r>
-        <w:t xml:space="preserve"> – Introduces new interfaces and algorithms for flexible and better random number generation.</w:t>
-      </w:r>
-    </w:p>
-    <w:p>
-      <w:pPr>
-        <w:numPr>
-          <w:ilvl w:val="0"/>
-          <w:numId w:val="7"/>
-        </w:numPr>
-      </w:pPr>
-      <w:r>
-        <w:rPr>
-          <w:b/>
-          <w:bCs/>
-        </w:rPr>
-        <w:t>Strongly Encapsulate JDK Internals</w:t>
-      </w:r>
-      <w:r>
-        <w:t xml:space="preserve"> – Prevents access to internal JDK APIs by default for better security and maintainability.</w:t>
-      </w:r>
-    </w:p>
-    <w:p>
-      <w:pPr>
-        <w:numPr>
-          <w:ilvl w:val="0"/>
-          <w:numId w:val="7"/>
-        </w:numPr>
-      </w:pPr>
-      <w:r>
-        <w:rPr>
-          <w:b/>
-          <w:bCs/>
-        </w:rPr>
-        <w:t>Context-Specific Deserialization Filters</w:t>
-      </w:r>
-      <w:r>
-        <w:t xml:space="preserve"> – Provides better control over deserialization to improve security.</w:t>
-      </w:r>
-    </w:p>
-    <w:p>
-      <w:pPr>
-        <w:numPr>
-          <w:ilvl w:val="0"/>
-          <w:numId w:val="7"/>
-        </w:numPr>
-      </w:pPr>
-      <w:r>
-        <w:rPr>
-          <w:b/>
-          <w:bCs/>
-        </w:rPr>
-        <w:t>Restore Always-Strict Floating-Point Semantics</w:t>
-      </w:r>
-      <w:r>
-        <w:t xml:space="preserve"> – Ensures floating-point calculations always follow strict IEEE 754 rules.</w:t>
-      </w:r>
-    </w:p>
-    <w:p>
-      <w:pPr>
-        <w:numPr>
-          <w:ilvl w:val="0"/>
-          <w:numId w:val="7"/>
-        </w:numPr>
-      </w:pPr>
-      <w:r>
-        <w:rPr>
-          <w:b/>
-          <w:bCs/>
-        </w:rPr>
-        <w:t>Deprecate the Security Manager for Removal</w:t>
-      </w:r>
-      <w:r>
-        <w:t xml:space="preserve"> – Marks the Security Manager for future removal as it is rarely used now.</w:t>
-      </w:r>
-    </w:p>
-    <w:p>
-      <w:pPr>
-        <w:numPr>
-          <w:ilvl w:val="0"/>
-          <w:numId w:val="7"/>
-        </w:numPr>
-      </w:pPr>
-      <w:r>
-        <w:rPr>
-          <w:b/>
-          <w:bCs/>
-        </w:rPr>
-        <w:t>Remove the Experimental AOT and JIT Compiler</w:t>
-      </w:r>
-      <w:r>
-        <w:t xml:space="preserve"> – Eliminates the previously experimental ahead-of-time and JIT compilers from the JDK.</w:t>
-      </w:r>
-    </w:p>
-    <w:p>
-      <w:r>
-        <w:t xml:space="preserve">If you want, I can also show </w:t>
-      </w:r>
-      <w:r>
-        <w:rPr>
-          <w:b/>
-          <w:bCs/>
-        </w:rPr>
-        <w:t>Java 17 features grouped into three categories (Language, JVM, Security)</w:t>
-      </w:r>
-      <w:r>
-        <w:t xml:space="preserve"> which is </w:t>
-      </w:r>
-      <w:r>
-        <w:rPr>
-          <w:b/>
-          <w:bCs/>
-        </w:rPr>
-        <w:t>very useful for interviews</w:t>
-      </w:r>
-      <w:r>
-        <w:t>.</w:t>
-      </w:r>
-    </w:p>
-    <w:p/>
-    <w:p/>
-    <w:p/>
-    <w:p/>
-    <w:p>
-      <w:r>
-        <w:rPr>
-          <w:b/>
-          <w:bCs/>
-        </w:rPr>
-        <w:lastRenderedPageBreak/>
-        <w:t>Java 21</w:t>
-      </w:r>
-      <w:r>
-        <w:t xml:space="preserve">, each explained in </w:t>
-      </w:r>
-      <w:r>
-        <w:rPr>
-          <w:b/>
-          <w:bCs/>
-        </w:rPr>
-        <w:t>one short statement</w:t>
-      </w:r>
-      <w:r>
-        <w:t>:</w:t>
+        <w:t>Virtual Threads</w:t>
+      </w:r>
+      <w:r>
+        <w:t xml:space="preserve"> – Introduces lightweight threads that enable high-concurrency applications with simpler thread management.</w:t>
       </w:r>
     </w:p>
     <w:p>
@@ -2087,10 +2194,10 @@
           <w:b/>
           <w:bCs/>
         </w:rPr>
-        <w:t>Virtual Threads</w:t>
-      </w:r>
-      <w:r>
-        <w:t xml:space="preserve"> – Introduces lightweight threads that enable high-concurrency applications with simpler thread management.</w:t>
+        <w:t>Sequenced Collections</w:t>
+      </w:r>
+      <w:r>
+        <w:t xml:space="preserve"> – Adds new interfaces that provide a well-defined encounter order for collections like List, Set, and Map.</w:t>
       </w:r>
     </w:p>
     <w:p>
@@ -2105,10 +2212,10 @@
           <w:b/>
           <w:bCs/>
         </w:rPr>
-        <w:t>Sequenced Collections</w:t>
-      </w:r>
-      <w:r>
-        <w:t xml:space="preserve"> – Adds new interfaces that provide a well-defined encounter order for collections like List, Set, and Map.</w:t>
+        <w:t>Pattern Matching for Switch</w:t>
+      </w:r>
+      <w:r>
+        <w:t xml:space="preserve"> – Allows pattern matching directly inside switch statements for more expressive conditional logic.</w:t>
       </w:r>
     </w:p>
     <w:p>
@@ -2123,36 +2230,10 @@
           <w:b/>
           <w:bCs/>
         </w:rPr>
-        <w:t>Pattern Matching for Switch</w:t>
-      </w:r>
-      <w:r>
-        <w:t xml:space="preserve"> – Allows pattern matching directly inside switch statements for more expressive conditional logic.</w:t>
-      </w:r>
-    </w:p>
-    <w:p>
-      <w:pPr>
-        <w:numPr>
-          <w:ilvl w:val="0"/>
-          <w:numId w:val="8"/>
-        </w:numPr>
-      </w:pPr>
-      <w:r>
-        <w:rPr>
-          <w:b/>
-          <w:bCs/>
-        </w:rPr>
         <w:t>Record Patterns</w:t>
       </w:r>
       <w:r>
-        <w:t xml:space="preserve"> – Enables </w:t>
-      </w:r>
-      <w:proofErr w:type="spellStart"/>
-      <w:r>
-        <w:t>destructuring</w:t>
-      </w:r>
-      <w:proofErr w:type="spellEnd"/>
-      <w:r>
-        <w:t xml:space="preserve"> of record objects to easily extract their components in pattern matching.</w:t>
+        <w:t xml:space="preserve"> – Enables destructuring of record objects to easily extract their components in pattern matching.</w:t>
       </w:r>
     </w:p>
     <w:p>

</xml_diff>